<commit_message>
feat: Add customerName to loan response and fix environment variables
</commit_message>
<xml_diff>
--- a/REPORTS.docx
+++ b/REPORTS.docx
@@ -1,6 +1,6 @@
 
 <file path=word/document.xml><?xml version="1.0" encoding="utf-8"?>
-<w:document xmlns:wpc="http://schemas.microsoft.com/office/word/2010/wordprocessingCanvas" xmlns:cx="http://schemas.microsoft.com/office/drawing/2014/chartex" xmlns:cx1="http://schemas.microsoft.com/office/drawing/2015/9/8/chartex" xmlns:cx2="http://schemas.microsoft.com/office/drawing/2015/10/21/chartex" xmlns:cx3="http://schemas.microsoft.com/office/drawing/2016/5/9/chartex" xmlns:cx4="http://schemas.microsoft.com/office/drawing/2016/5/10/chartex" xmlns:cx5="http://schemas.microsoft.com/office/drawing/2016/5/11/chartex" xmlns:cx6="http://schemas.microsoft.com/office/drawing/2016/5/12/chartex" xmlns:cx7="http://schemas.microsoft.com/office/drawing/2016/5/13/chartex" xmlns:cx8="http://schemas.microsoft.com/office/drawing/2016/5/14/chartex" xmlns:mc="http://schemas.openxmlformats.org/markup-compatibility/2006" xmlns:aink="http://schemas.microsoft.com/office/drawing/2016/ink" xmlns:am3d="http://schemas.microsoft.com/office/drawing/2017/model3d" xmlns:o="urn:schemas-microsoft-com:office:office" xmlns:oel="http://schemas.microsoft.com/office/2019/extlst" xmlns:r="http://schemas.openxmlformats.org/officeDocument/2006/relationships" xmlns:m="http://schemas.openxmlformats.org/officeDocument/2006/math" xmlns:v="urn:schemas-microsoft-com:vml" xmlns:wp14="http://schemas.microsoft.com/office/word/2010/wordprocessingDrawing" xmlns:wp="http://schemas.openxmlformats.org/drawingml/2006/wordprocessingDrawing" xmlns:w10="urn:schemas-microsoft-com:office:word" xmlns:w="http://schemas.openxmlformats.org/wordprocessingml/2006/main" xmlns:w14="http://schemas.microsoft.com/office/word/2010/wordml" xmlns:w15="http://schemas.microsoft.com/office/word/2012/wordml" xmlns:w16cex="http://schemas.microsoft.com/office/word/2018/wordml/cex" xmlns:w16cid="http://schemas.microsoft.com/office/word/2016/wordml/cid" xmlns:w16="http://schemas.microsoft.com/office/word/2018/wordml" xmlns:w16du="http://schemas.microsoft.com/office/word/2023/wordml/word16du" xmlns:w16sdtdh="http://schemas.microsoft.com/office/word/2020/wordml/sdtdatahash" xmlns:w16sdtfl="http://schemas.microsoft.com/office/word/2024/wordml/sdtformatlock" xmlns:w16se="http://schemas.microsoft.com/office/word/2015/wordml/symex" xmlns:wpg="http://schemas.microsoft.com/office/word/2010/wordprocessingGroup" xmlns:wpi="http://schemas.microsoft.com/office/word/2010/wordprocessingInk" xmlns:wne="http://schemas.microsoft.com/office/word/2006/wordml" xmlns:wps="http://schemas.microsoft.com/office/word/2010/wordprocessingShape" mc:Ignorable="w14 w15 w16se w16cid w16 w16cex w16sdtdh w16sdtfl w16du wp14">
+<w:document xmlns:wpc="http://schemas.microsoft.com/office/word/2010/wordprocessingCanvas" xmlns:mc="http://schemas.openxmlformats.org/markup-compatibility/2006" xmlns:o="urn:schemas-microsoft-com:office:office" xmlns:r="http://schemas.openxmlformats.org/officeDocument/2006/relationships" xmlns:m="http://schemas.openxmlformats.org/officeDocument/2006/math" xmlns:v="urn:schemas-microsoft-com:vml" xmlns:wp14="http://schemas.microsoft.com/office/word/2010/wordprocessingDrawing" xmlns:wp="http://schemas.openxmlformats.org/drawingml/2006/wordprocessingDrawing" xmlns:w="http://schemas.openxmlformats.org/wordprocessingml/2006/main" xmlns:w14="http://schemas.microsoft.com/office/word/2010/wordml" xmlns:w10="urn:schemas-microsoft-com:office:word" xmlns:w15="http://schemas.microsoft.com/office/word/2012/wordml" xmlns:wpg="http://schemas.microsoft.com/office/word/2010/wordprocessingGroup" xmlns:wpi="http://schemas.microsoft.com/office/word/2010/wordprocessingInk" xmlns:wne="http://schemas.microsoft.com/office/word/2006/wordml" xmlns:wps="http://schemas.microsoft.com/office/word/2010/wordprocessingShape" xmlns:wpsCustomData="http://www.wps.cn/officeDocument/2013/wpsCustomData" mc:Ignorable="w14 w15 wp14">
   <w:body>
     <w:p>
       <w:pPr>
@@ -18,25 +18,7 @@
           <w:sz w:val="72"/>
           <w:szCs w:val="72"/>
         </w:rPr>
-        <w:t xml:space="preserve">         </w:t>
-      </w:r>
-      <w:r>
-        <w:rPr>
-          <w:b/>
-          <w:bCs/>
-          <w:sz w:val="72"/>
-          <w:szCs w:val="72"/>
-        </w:rPr>
-        <w:t xml:space="preserve">   </w:t>
-      </w:r>
-      <w:r>
-        <w:rPr>
-          <w:b/>
-          <w:bCs/>
-          <w:sz w:val="72"/>
-          <w:szCs w:val="72"/>
-        </w:rPr>
-        <w:t xml:space="preserve">     REPORTS</w:t>
+        <w:t xml:space="preserve">                 REPORTS</w:t>
       </w:r>
     </w:p>
     <w:p>
@@ -75,7 +57,7 @@
           <w:szCs w:val="48"/>
         </w:rPr>
         <w:drawing>
-          <wp:inline distT="0" distB="0" distL="0" distR="0" wp14:anchorId="213311B8" wp14:editId="3C952773">
+          <wp:inline distT="0" distB="0" distL="0" distR="0">
             <wp:extent cx="5731510" cy="1551940"/>
             <wp:effectExtent l="0" t="0" r="2540" b="0"/>
             <wp:docPr id="1626407354" name="Picture 1"/>
@@ -86,8 +68,10 @@
               <a:graphicData uri="http://schemas.openxmlformats.org/drawingml/2006/picture">
                 <pic:pic xmlns:pic="http://schemas.openxmlformats.org/drawingml/2006/picture">
                   <pic:nvPicPr>
-                    <pic:cNvPr id="1626407354" name=""/>
-                    <pic:cNvPicPr/>
+                    <pic:cNvPr id="1626407354" name="Picture 1"/>
+                    <pic:cNvPicPr>
+                      <a:picLocks noChangeAspect="1"/>
+                    </pic:cNvPicPr>
                   </pic:nvPicPr>
                   <pic:blipFill>
                     <a:blip r:embed="rId6"/>
@@ -128,7 +112,7 @@
           <w:szCs w:val="48"/>
         </w:rPr>
         <w:drawing>
-          <wp:inline distT="0" distB="0" distL="0" distR="0" wp14:anchorId="1EC3D790" wp14:editId="73BB0B3F">
+          <wp:inline distT="0" distB="0" distL="0" distR="0">
             <wp:extent cx="5731510" cy="1520825"/>
             <wp:effectExtent l="0" t="0" r="2540" b="3175"/>
             <wp:docPr id="1253693109" name="Picture 1"/>
@@ -139,8 +123,10 @@
               <a:graphicData uri="http://schemas.openxmlformats.org/drawingml/2006/picture">
                 <pic:pic xmlns:pic="http://schemas.openxmlformats.org/drawingml/2006/picture">
                   <pic:nvPicPr>
-                    <pic:cNvPr id="1253693109" name=""/>
-                    <pic:cNvPicPr/>
+                    <pic:cNvPr id="1253693109" name="Picture 1"/>
+                    <pic:cNvPicPr>
+                      <a:picLocks noChangeAspect="1"/>
+                    </pic:cNvPicPr>
                   </pic:nvPicPr>
                   <pic:blipFill>
                     <a:blip r:embed="rId7"/>
@@ -181,7 +167,7 @@
           <w:szCs w:val="48"/>
         </w:rPr>
         <w:drawing>
-          <wp:inline distT="0" distB="0" distL="0" distR="0" wp14:anchorId="5B6CEE95" wp14:editId="15DD0ED5">
+          <wp:inline distT="0" distB="0" distL="0" distR="0">
             <wp:extent cx="5731510" cy="1485900"/>
             <wp:effectExtent l="0" t="0" r="2540" b="0"/>
             <wp:docPr id="1621630806" name="Picture 1"/>
@@ -192,8 +178,10 @@
               <a:graphicData uri="http://schemas.openxmlformats.org/drawingml/2006/picture">
                 <pic:pic xmlns:pic="http://schemas.openxmlformats.org/drawingml/2006/picture">
                   <pic:nvPicPr>
-                    <pic:cNvPr id="1621630806" name=""/>
-                    <pic:cNvPicPr/>
+                    <pic:cNvPr id="1621630806" name="Picture 1"/>
+                    <pic:cNvPicPr>
+                      <a:picLocks noChangeAspect="1"/>
+                    </pic:cNvPicPr>
                   </pic:nvPicPr>
                   <pic:blipFill>
                     <a:blip r:embed="rId8"/>
@@ -234,7 +222,7 @@
           <w:szCs w:val="48"/>
         </w:rPr>
         <w:drawing>
-          <wp:inline distT="0" distB="0" distL="0" distR="0" wp14:anchorId="555B9BB4" wp14:editId="36DCE981">
+          <wp:inline distT="0" distB="0" distL="0" distR="0">
             <wp:extent cx="5731510" cy="1704340"/>
             <wp:effectExtent l="0" t="0" r="2540" b="0"/>
             <wp:docPr id="1616038424" name="Picture 1"/>
@@ -245,8 +233,10 @@
               <a:graphicData uri="http://schemas.openxmlformats.org/drawingml/2006/picture">
                 <pic:pic xmlns:pic="http://schemas.openxmlformats.org/drawingml/2006/picture">
                   <pic:nvPicPr>
-                    <pic:cNvPr id="1616038424" name=""/>
-                    <pic:cNvPicPr/>
+                    <pic:cNvPr id="1616038424" name="Picture 1"/>
+                    <pic:cNvPicPr>
+                      <a:picLocks noChangeAspect="1"/>
+                    </pic:cNvPicPr>
                   </pic:nvPicPr>
                   <pic:blipFill>
                     <a:blip r:embed="rId9"/>
@@ -286,9 +276,8 @@
           <w:sz w:val="48"/>
           <w:szCs w:val="48"/>
         </w:rPr>
-        <w:lastRenderedPageBreak/>
         <w:drawing>
-          <wp:inline distT="0" distB="0" distL="0" distR="0" wp14:anchorId="5AC70AFE" wp14:editId="714AA3E6">
+          <wp:inline distT="0" distB="0" distL="0" distR="0">
             <wp:extent cx="5731510" cy="1434465"/>
             <wp:effectExtent l="0" t="0" r="2540" b="0"/>
             <wp:docPr id="210971246" name="Picture 1"/>
@@ -299,8 +288,10 @@
               <a:graphicData uri="http://schemas.openxmlformats.org/drawingml/2006/picture">
                 <pic:pic xmlns:pic="http://schemas.openxmlformats.org/drawingml/2006/picture">
                   <pic:nvPicPr>
-                    <pic:cNvPr id="210971246" name=""/>
-                    <pic:cNvPicPr/>
+                    <pic:cNvPr id="210971246" name="Picture 1"/>
+                    <pic:cNvPicPr>
+                      <a:picLocks noChangeAspect="1"/>
+                    </pic:cNvPicPr>
                   </pic:nvPicPr>
                   <pic:blipFill>
                     <a:blip r:embed="rId10"/>
@@ -333,7 +324,6 @@
           <w:szCs w:val="48"/>
         </w:rPr>
       </w:pPr>
-      <w:proofErr w:type="spellStart"/>
       <w:r>
         <w:rPr>
           <w:b/>
@@ -343,7 +333,6 @@
         </w:rPr>
         <w:t>Sonarqube</w:t>
       </w:r>
-      <w:proofErr w:type="spellEnd"/>
     </w:p>
     <w:p>
       <w:pPr>
@@ -362,7 +351,7 @@
           <w:szCs w:val="48"/>
         </w:rPr>
         <w:drawing>
-          <wp:inline distT="0" distB="0" distL="0" distR="0" wp14:anchorId="1D7B85D0" wp14:editId="5B38327E">
+          <wp:inline distT="0" distB="0" distL="0" distR="0">
             <wp:extent cx="5731510" cy="2776220"/>
             <wp:effectExtent l="0" t="0" r="2540" b="5080"/>
             <wp:docPr id="1129212131" name="Picture 1"/>
@@ -373,8 +362,10 @@
               <a:graphicData uri="http://schemas.openxmlformats.org/drawingml/2006/picture">
                 <pic:pic xmlns:pic="http://schemas.openxmlformats.org/drawingml/2006/picture">
                   <pic:nvPicPr>
-                    <pic:cNvPr id="1129212131" name=""/>
-                    <pic:cNvPicPr/>
+                    <pic:cNvPr id="1129212131" name="Picture 1"/>
+                    <pic:cNvPicPr>
+                      <a:picLocks noChangeAspect="1"/>
+                    </pic:cNvPicPr>
                   </pic:nvPicPr>
                   <pic:blipFill>
                     <a:blip r:embed="rId11"/>
@@ -434,7 +425,7 @@
           <w:szCs w:val="48"/>
         </w:rPr>
         <w:drawing>
-          <wp:inline distT="0" distB="0" distL="0" distR="0" wp14:anchorId="2F1A71D7" wp14:editId="17AE7AA5">
+          <wp:inline distT="0" distB="0" distL="0" distR="0">
             <wp:extent cx="5731510" cy="3040380"/>
             <wp:effectExtent l="0" t="0" r="2540" b="7620"/>
             <wp:docPr id="588281186" name="Picture 1"/>
@@ -445,8 +436,10 @@
               <a:graphicData uri="http://schemas.openxmlformats.org/drawingml/2006/picture">
                 <pic:pic xmlns:pic="http://schemas.openxmlformats.org/drawingml/2006/picture">
                   <pic:nvPicPr>
-                    <pic:cNvPr id="588281186" name=""/>
-                    <pic:cNvPicPr/>
+                    <pic:cNvPr id="588281186" name="Picture 1"/>
+                    <pic:cNvPicPr>
+                      <a:picLocks noChangeAspect="1"/>
+                    </pic:cNvPicPr>
                   </pic:nvPicPr>
                   <pic:blipFill>
                     <a:blip r:embed="rId12"/>
@@ -486,7 +479,6 @@
           <w:sz w:val="52"/>
           <w:szCs w:val="52"/>
         </w:rPr>
-        <w:lastRenderedPageBreak/>
         <w:t>EUREKA SERVER</w:t>
       </w:r>
     </w:p>
@@ -507,7 +499,7 @@
           <w:szCs w:val="52"/>
         </w:rPr>
         <w:drawing>
-          <wp:inline distT="0" distB="0" distL="0" distR="0" wp14:anchorId="6FB8CC2A" wp14:editId="6118C797">
+          <wp:inline distT="0" distB="0" distL="0" distR="0">
             <wp:extent cx="5731510" cy="3112770"/>
             <wp:effectExtent l="0" t="0" r="2540" b="0"/>
             <wp:docPr id="1291405032" name="Picture 1"/>
@@ -518,8 +510,10 @@
               <a:graphicData uri="http://schemas.openxmlformats.org/drawingml/2006/picture">
                 <pic:pic xmlns:pic="http://schemas.openxmlformats.org/drawingml/2006/picture">
                   <pic:nvPicPr>
-                    <pic:cNvPr id="1291405032" name=""/>
-                    <pic:cNvPicPr/>
+                    <pic:cNvPr id="1291405032" name="Picture 1"/>
+                    <pic:cNvPicPr>
+                      <a:picLocks noChangeAspect="1"/>
+                    </pic:cNvPicPr>
                   </pic:nvPicPr>
                   <pic:blipFill>
                     <a:blip r:embed="rId13"/>
@@ -546,6 +540,126 @@
     <w:p>
       <w:pPr>
         <w:rPr>
+          <w:rFonts w:hint="default"/>
+          <w:b/>
+          <w:bCs/>
+          <w:sz w:val="52"/>
+          <w:szCs w:val="52"/>
+          <w:lang w:val="en-IN"/>
+        </w:rPr>
+      </w:pPr>
+      <w:r>
+        <w:rPr>
+          <w:rFonts w:hint="default"/>
+          <w:b/>
+          <w:bCs/>
+          <w:sz w:val="52"/>
+          <w:szCs w:val="52"/>
+          <w:lang w:val="en-IN"/>
+        </w:rPr>
+        <w:t>Ci-cd</w:t>
+      </w:r>
+    </w:p>
+    <w:p>
+      <w:r>
+        <w:drawing>
+          <wp:inline distT="0" distB="0" distL="114300" distR="114300">
+            <wp:extent cx="5718175" cy="1800860"/>
+            <wp:effectExtent l="0" t="0" r="12065" b="12700"/>
+            <wp:docPr id="1" name="Picture 1"/>
+            <wp:cNvGraphicFramePr>
+              <a:graphicFrameLocks xmlns:a="http://schemas.openxmlformats.org/drawingml/2006/main" noChangeAspect="1"/>
+            </wp:cNvGraphicFramePr>
+            <a:graphic xmlns:a="http://schemas.openxmlformats.org/drawingml/2006/main">
+              <a:graphicData uri="http://schemas.openxmlformats.org/drawingml/2006/picture">
+                <pic:pic xmlns:pic="http://schemas.openxmlformats.org/drawingml/2006/picture">
+                  <pic:nvPicPr>
+                    <pic:cNvPr id="1" name="Picture 1"/>
+                    <pic:cNvPicPr>
+                      <a:picLocks noChangeAspect="1"/>
+                    </pic:cNvPicPr>
+                  </pic:nvPicPr>
+                  <pic:blipFill>
+                    <a:blip r:embed="rId14"/>
+                    <a:stretch>
+                      <a:fillRect/>
+                    </a:stretch>
+                  </pic:blipFill>
+                  <pic:spPr>
+                    <a:xfrm>
+                      <a:off x="0" y="0"/>
+                      <a:ext cx="5718175" cy="1800860"/>
+                    </a:xfrm>
+                    <a:prstGeom prst="rect">
+                      <a:avLst/>
+                    </a:prstGeom>
+                    <a:noFill/>
+                    <a:ln>
+                      <a:noFill/>
+                    </a:ln>
+                  </pic:spPr>
+                </pic:pic>
+              </a:graphicData>
+            </a:graphic>
+          </wp:inline>
+        </w:drawing>
+      </w:r>
+    </w:p>
+    <w:p/>
+    <w:p>
+      <w:pPr>
+        <w:rPr>
+          <w:rFonts w:hint="default"/>
+          <w:lang w:val="en-IN"/>
+        </w:rPr>
+      </w:pPr>
+      <w:r>
+        <w:drawing>
+          <wp:inline distT="0" distB="0" distL="114300" distR="114300">
+            <wp:extent cx="5727700" cy="2255520"/>
+            <wp:effectExtent l="0" t="0" r="2540" b="0"/>
+            <wp:docPr id="2" name="Picture 2"/>
+            <wp:cNvGraphicFramePr>
+              <a:graphicFrameLocks xmlns:a="http://schemas.openxmlformats.org/drawingml/2006/main" noChangeAspect="1"/>
+            </wp:cNvGraphicFramePr>
+            <a:graphic xmlns:a="http://schemas.openxmlformats.org/drawingml/2006/main">
+              <a:graphicData uri="http://schemas.openxmlformats.org/drawingml/2006/picture">
+                <pic:pic xmlns:pic="http://schemas.openxmlformats.org/drawingml/2006/picture">
+                  <pic:nvPicPr>
+                    <pic:cNvPr id="2" name="Picture 2"/>
+                    <pic:cNvPicPr>
+                      <a:picLocks noChangeAspect="1"/>
+                    </pic:cNvPicPr>
+                  </pic:nvPicPr>
+                  <pic:blipFill>
+                    <a:blip r:embed="rId15"/>
+                    <a:stretch>
+                      <a:fillRect/>
+                    </a:stretch>
+                  </pic:blipFill>
+                  <pic:spPr>
+                    <a:xfrm>
+                      <a:off x="0" y="0"/>
+                      <a:ext cx="5727700" cy="2255520"/>
+                    </a:xfrm>
+                    <a:prstGeom prst="rect">
+                      <a:avLst/>
+                    </a:prstGeom>
+                    <a:noFill/>
+                    <a:ln>
+                      <a:noFill/>
+                    </a:ln>
+                  </pic:spPr>
+                </pic:pic>
+              </a:graphicData>
+            </a:graphic>
+          </wp:inline>
+        </w:drawing>
+      </w:r>
+    </w:p>
+    <w:p>
+      <w:pPr>
+        <w:rPr>
           <w:b/>
           <w:bCs/>
           <w:sz w:val="52"/>
@@ -589,7 +703,7 @@
           <w:szCs w:val="52"/>
         </w:rPr>
         <w:drawing>
-          <wp:inline distT="0" distB="0" distL="0" distR="0" wp14:anchorId="254796F5" wp14:editId="17905909">
+          <wp:inline distT="0" distB="0" distL="0" distR="0">
             <wp:extent cx="5731510" cy="2598420"/>
             <wp:effectExtent l="0" t="0" r="2540" b="0"/>
             <wp:docPr id="717878348" name="Picture 1"/>
@@ -600,11 +714,13 @@
               <a:graphicData uri="http://schemas.openxmlformats.org/drawingml/2006/picture">
                 <pic:pic xmlns:pic="http://schemas.openxmlformats.org/drawingml/2006/picture">
                   <pic:nvPicPr>
-                    <pic:cNvPr id="717878348" name=""/>
-                    <pic:cNvPicPr/>
+                    <pic:cNvPr id="717878348" name="Picture 1"/>
+                    <pic:cNvPicPr>
+                      <a:picLocks noChangeAspect="1"/>
+                    </pic:cNvPicPr>
                   </pic:nvPicPr>
                   <pic:blipFill>
-                    <a:blip r:embed="rId14"/>
+                    <a:blip r:embed="rId16"/>
                     <a:stretch>
                       <a:fillRect/>
                     </a:stretch>
@@ -661,20 +777,8 @@
           <w:sz w:val="52"/>
           <w:szCs w:val="52"/>
         </w:rPr>
-        <w:lastRenderedPageBreak/>
-        <w:t>Rabbit-</w:t>
-      </w:r>
-      <w:proofErr w:type="spellStart"/>
-      <w:r>
-        <w:rPr>
-          <w:b/>
-          <w:bCs/>
-          <w:sz w:val="52"/>
-          <w:szCs w:val="52"/>
-        </w:rPr>
-        <w:t>mq</w:t>
-      </w:r>
-      <w:proofErr w:type="spellEnd"/>
+        <w:t>Rabbit-mq</w:t>
+      </w:r>
     </w:p>
     <w:p>
       <w:pPr>
@@ -693,7 +797,7 @@
           <w:szCs w:val="52"/>
         </w:rPr>
         <w:drawing>
-          <wp:inline distT="0" distB="0" distL="0" distR="0" wp14:anchorId="7A78283D" wp14:editId="1A33A9F4">
+          <wp:inline distT="0" distB="0" distL="0" distR="0">
             <wp:extent cx="5731510" cy="2898775"/>
             <wp:effectExtent l="0" t="0" r="2540" b="0"/>
             <wp:docPr id="49025957" name="Picture 1"/>
@@ -704,11 +808,13 @@
               <a:graphicData uri="http://schemas.openxmlformats.org/drawingml/2006/picture">
                 <pic:pic xmlns:pic="http://schemas.openxmlformats.org/drawingml/2006/picture">
                   <pic:nvPicPr>
-                    <pic:cNvPr id="49025957" name=""/>
-                    <pic:cNvPicPr/>
+                    <pic:cNvPr id="49025957" name="Picture 1"/>
+                    <pic:cNvPicPr>
+                      <a:picLocks noChangeAspect="1"/>
+                    </pic:cNvPicPr>
                   </pic:nvPicPr>
                   <pic:blipFill>
-                    <a:blip r:embed="rId15"/>
+                    <a:blip r:embed="rId17"/>
                     <a:stretch>
                       <a:fillRect/>
                     </a:stretch>
@@ -742,6 +848,233 @@
     <w:p>
       <w:pPr>
         <w:rPr>
+          <w:rFonts w:hint="default"/>
+          <w:b/>
+          <w:bCs/>
+          <w:sz w:val="52"/>
+          <w:szCs w:val="52"/>
+          <w:lang w:val="en-IN"/>
+        </w:rPr>
+      </w:pPr>
+      <w:r>
+        <w:rPr>
+          <w:rFonts w:hint="default"/>
+          <w:b/>
+          <w:bCs/>
+          <w:sz w:val="52"/>
+          <w:szCs w:val="52"/>
+          <w:lang w:val="en-IN"/>
+        </w:rPr>
+        <w:t>Circuit-breaker-using resilience4j</w:t>
+      </w:r>
+    </w:p>
+    <w:p>
+      <w:r>
+        <w:drawing>
+          <wp:inline distT="0" distB="0" distL="114300" distR="114300">
+            <wp:extent cx="5722620" cy="3247390"/>
+            <wp:effectExtent l="0" t="0" r="7620" b="13970"/>
+            <wp:docPr id="7" name="Picture 7"/>
+            <wp:cNvGraphicFramePr>
+              <a:graphicFrameLocks xmlns:a="http://schemas.openxmlformats.org/drawingml/2006/main" noChangeAspect="1"/>
+            </wp:cNvGraphicFramePr>
+            <a:graphic xmlns:a="http://schemas.openxmlformats.org/drawingml/2006/main">
+              <a:graphicData uri="http://schemas.openxmlformats.org/drawingml/2006/picture">
+                <pic:pic xmlns:pic="http://schemas.openxmlformats.org/drawingml/2006/picture">
+                  <pic:nvPicPr>
+                    <pic:cNvPr id="7" name="Picture 7"/>
+                    <pic:cNvPicPr>
+                      <a:picLocks noChangeAspect="1"/>
+                    </pic:cNvPicPr>
+                  </pic:nvPicPr>
+                  <pic:blipFill>
+                    <a:blip r:embed="rId18"/>
+                    <a:stretch>
+                      <a:fillRect/>
+                    </a:stretch>
+                  </pic:blipFill>
+                  <pic:spPr>
+                    <a:xfrm>
+                      <a:off x="0" y="0"/>
+                      <a:ext cx="5722620" cy="3247390"/>
+                    </a:xfrm>
+                    <a:prstGeom prst="rect">
+                      <a:avLst/>
+                    </a:prstGeom>
+                    <a:noFill/>
+                    <a:ln>
+                      <a:noFill/>
+                    </a:ln>
+                  </pic:spPr>
+                </pic:pic>
+              </a:graphicData>
+            </a:graphic>
+          </wp:inline>
+        </w:drawing>
+      </w:r>
+    </w:p>
+    <w:p>
+      <w:pPr>
+        <w:rPr>
+          <w:rFonts w:hint="default"/>
+          <w:lang w:val="en-IN"/>
+        </w:rPr>
+      </w:pPr>
+    </w:p>
+    <w:p>
+      <w:r>
+        <w:drawing>
+          <wp:inline distT="0" distB="0" distL="114300" distR="114300">
+            <wp:extent cx="5724525" cy="2288540"/>
+            <wp:effectExtent l="0" t="0" r="5715" b="12700"/>
+            <wp:docPr id="8" name="Picture 8"/>
+            <wp:cNvGraphicFramePr>
+              <a:graphicFrameLocks xmlns:a="http://schemas.openxmlformats.org/drawingml/2006/main" noChangeAspect="1"/>
+            </wp:cNvGraphicFramePr>
+            <a:graphic xmlns:a="http://schemas.openxmlformats.org/drawingml/2006/main">
+              <a:graphicData uri="http://schemas.openxmlformats.org/drawingml/2006/picture">
+                <pic:pic xmlns:pic="http://schemas.openxmlformats.org/drawingml/2006/picture">
+                  <pic:nvPicPr>
+                    <pic:cNvPr id="8" name="Picture 8"/>
+                    <pic:cNvPicPr>
+                      <a:picLocks noChangeAspect="1"/>
+                    </pic:cNvPicPr>
+                  </pic:nvPicPr>
+                  <pic:blipFill>
+                    <a:blip r:embed="rId19"/>
+                    <a:stretch>
+                      <a:fillRect/>
+                    </a:stretch>
+                  </pic:blipFill>
+                  <pic:spPr>
+                    <a:xfrm>
+                      <a:off x="0" y="0"/>
+                      <a:ext cx="5724525" cy="2288540"/>
+                    </a:xfrm>
+                    <a:prstGeom prst="rect">
+                      <a:avLst/>
+                    </a:prstGeom>
+                    <a:noFill/>
+                    <a:ln>
+                      <a:noFill/>
+                    </a:ln>
+                  </pic:spPr>
+                </pic:pic>
+              </a:graphicData>
+            </a:graphic>
+          </wp:inline>
+        </w:drawing>
+      </w:r>
+      <w:bookmarkStart w:id="0" w:name="_GoBack"/>
+      <w:bookmarkEnd w:id="0"/>
+      <w:r>
+        <w:drawing>
+          <wp:inline distT="0" distB="0" distL="114300" distR="114300">
+            <wp:extent cx="5728970" cy="1248410"/>
+            <wp:effectExtent l="0" t="0" r="1270" b="1270"/>
+            <wp:docPr id="6" name="Picture 6"/>
+            <wp:cNvGraphicFramePr>
+              <a:graphicFrameLocks xmlns:a="http://schemas.openxmlformats.org/drawingml/2006/main" noChangeAspect="1"/>
+            </wp:cNvGraphicFramePr>
+            <a:graphic xmlns:a="http://schemas.openxmlformats.org/drawingml/2006/main">
+              <a:graphicData uri="http://schemas.openxmlformats.org/drawingml/2006/picture">
+                <pic:pic xmlns:pic="http://schemas.openxmlformats.org/drawingml/2006/picture">
+                  <pic:nvPicPr>
+                    <pic:cNvPr id="6" name="Picture 6"/>
+                    <pic:cNvPicPr>
+                      <a:picLocks noChangeAspect="1"/>
+                    </pic:cNvPicPr>
+                  </pic:nvPicPr>
+                  <pic:blipFill>
+                    <a:blip r:embed="rId20"/>
+                    <a:stretch>
+                      <a:fillRect/>
+                    </a:stretch>
+                  </pic:blipFill>
+                  <pic:spPr>
+                    <a:xfrm>
+                      <a:off x="0" y="0"/>
+                      <a:ext cx="5728970" cy="1248410"/>
+                    </a:xfrm>
+                    <a:prstGeom prst="rect">
+                      <a:avLst/>
+                    </a:prstGeom>
+                    <a:noFill/>
+                    <a:ln>
+                      <a:noFill/>
+                    </a:ln>
+                  </pic:spPr>
+                </pic:pic>
+              </a:graphicData>
+            </a:graphic>
+          </wp:inline>
+        </w:drawing>
+      </w:r>
+    </w:p>
+    <w:p>
+      <w:pPr>
+        <w:rPr>
+          <w:rFonts w:hint="default"/>
+          <w:lang w:val="en-IN"/>
+        </w:rPr>
+      </w:pPr>
+      <w:r>
+        <w:drawing>
+          <wp:inline distT="0" distB="0" distL="114300" distR="114300">
+            <wp:extent cx="5730875" cy="2059305"/>
+            <wp:effectExtent l="0" t="0" r="14605" b="13335"/>
+            <wp:docPr id="5" name="Picture 5"/>
+            <wp:cNvGraphicFramePr>
+              <a:graphicFrameLocks xmlns:a="http://schemas.openxmlformats.org/drawingml/2006/main" noChangeAspect="1"/>
+            </wp:cNvGraphicFramePr>
+            <a:graphic xmlns:a="http://schemas.openxmlformats.org/drawingml/2006/main">
+              <a:graphicData uri="http://schemas.openxmlformats.org/drawingml/2006/picture">
+                <pic:pic xmlns:pic="http://schemas.openxmlformats.org/drawingml/2006/picture">
+                  <pic:nvPicPr>
+                    <pic:cNvPr id="5" name="Picture 5"/>
+                    <pic:cNvPicPr>
+                      <a:picLocks noChangeAspect="1"/>
+                    </pic:cNvPicPr>
+                  </pic:nvPicPr>
+                  <pic:blipFill>
+                    <a:blip r:embed="rId21"/>
+                    <a:stretch>
+                      <a:fillRect/>
+                    </a:stretch>
+                  </pic:blipFill>
+                  <pic:spPr>
+                    <a:xfrm>
+                      <a:off x="0" y="0"/>
+                      <a:ext cx="5730875" cy="2059305"/>
+                    </a:xfrm>
+                    <a:prstGeom prst="rect">
+                      <a:avLst/>
+                    </a:prstGeom>
+                    <a:noFill/>
+                    <a:ln>
+                      <a:noFill/>
+                    </a:ln>
+                  </pic:spPr>
+                </pic:pic>
+              </a:graphicData>
+            </a:graphic>
+          </wp:inline>
+        </w:drawing>
+      </w:r>
+    </w:p>
+    <w:p>
+      <w:pPr>
+        <w:rPr>
+          <w:b/>
+          <w:bCs/>
+          <w:sz w:val="52"/>
+          <w:szCs w:val="52"/>
+        </w:rPr>
+      </w:pPr>
+    </w:p>
+    <w:p>
+      <w:pPr>
+        <w:rPr>
           <w:b/>
           <w:bCs/>
           <w:sz w:val="52"/>
@@ -785,8 +1118,8 @@
           <w:szCs w:val="52"/>
         </w:rPr>
         <w:drawing>
-          <wp:inline distT="0" distB="0" distL="0" distR="0" wp14:anchorId="15000F62" wp14:editId="117EF21E">
-            <wp:extent cx="5606143" cy="2739718"/>
+          <wp:inline distT="0" distB="0" distL="0" distR="0">
+            <wp:extent cx="5605780" cy="2739390"/>
             <wp:effectExtent l="0" t="0" r="0" b="3810"/>
             <wp:docPr id="1173238421" name="Picture 1"/>
             <wp:cNvGraphicFramePr>
@@ -796,11 +1129,13 @@
               <a:graphicData uri="http://schemas.openxmlformats.org/drawingml/2006/picture">
                 <pic:pic xmlns:pic="http://schemas.openxmlformats.org/drawingml/2006/picture">
                   <pic:nvPicPr>
-                    <pic:cNvPr id="1173238421" name=""/>
-                    <pic:cNvPicPr/>
+                    <pic:cNvPr id="1173238421" name="Picture 1"/>
+                    <pic:cNvPicPr>
+                      <a:picLocks noChangeAspect="1"/>
+                    </pic:cNvPicPr>
                   </pic:nvPicPr>
                   <pic:blipFill>
-                    <a:blip r:embed="rId16"/>
+                    <a:blip r:embed="rId22"/>
                     <a:stretch>
                       <a:fillRect/>
                     </a:stretch>
@@ -847,10 +1182,9 @@
           <w:sz w:val="52"/>
           <w:szCs w:val="52"/>
         </w:rPr>
-        <w:lastRenderedPageBreak/>
         <w:drawing>
-          <wp:inline distT="0" distB="0" distL="0" distR="0" wp14:anchorId="0EA062FB" wp14:editId="587D2E95">
-            <wp:extent cx="5421086" cy="2907542"/>
+          <wp:inline distT="0" distB="0" distL="0" distR="0">
+            <wp:extent cx="5420995" cy="2907030"/>
             <wp:effectExtent l="0" t="0" r="8255" b="7620"/>
             <wp:docPr id="1916852372" name="Picture 1"/>
             <wp:cNvGraphicFramePr>
@@ -860,11 +1194,13 @@
               <a:graphicData uri="http://schemas.openxmlformats.org/drawingml/2006/picture">
                 <pic:pic xmlns:pic="http://schemas.openxmlformats.org/drawingml/2006/picture">
                   <pic:nvPicPr>
-                    <pic:cNvPr id="1916852372" name=""/>
-                    <pic:cNvPicPr/>
+                    <pic:cNvPr id="1916852372" name="Picture 1"/>
+                    <pic:cNvPicPr>
+                      <a:picLocks noChangeAspect="1"/>
+                    </pic:cNvPicPr>
                   </pic:nvPicPr>
                   <pic:blipFill>
-                    <a:blip r:embed="rId17"/>
+                    <a:blip r:embed="rId23"/>
                     <a:stretch>
                       <a:fillRect/>
                     </a:stretch>
@@ -902,8 +1238,8 @@
           <w:szCs w:val="52"/>
         </w:rPr>
         <w:drawing>
-          <wp:inline distT="0" distB="0" distL="0" distR="0" wp14:anchorId="34B67B88" wp14:editId="134B66C6">
-            <wp:extent cx="5878286" cy="3066139"/>
+          <wp:inline distT="0" distB="0" distL="0" distR="0">
+            <wp:extent cx="5878195" cy="3065780"/>
             <wp:effectExtent l="0" t="0" r="8255" b="1270"/>
             <wp:docPr id="583256566" name="Picture 1"/>
             <wp:cNvGraphicFramePr>
@@ -913,11 +1249,13 @@
               <a:graphicData uri="http://schemas.openxmlformats.org/drawingml/2006/picture">
                 <pic:pic xmlns:pic="http://schemas.openxmlformats.org/drawingml/2006/picture">
                   <pic:nvPicPr>
-                    <pic:cNvPr id="583256566" name=""/>
-                    <pic:cNvPicPr/>
+                    <pic:cNvPr id="583256566" name="Picture 1"/>
+                    <pic:cNvPicPr>
+                      <a:picLocks noChangeAspect="1"/>
+                    </pic:cNvPicPr>
                   </pic:nvPicPr>
                   <pic:blipFill>
-                    <a:blip r:embed="rId18"/>
+                    <a:blip r:embed="rId24"/>
                     <a:stretch>
                       <a:fillRect/>
                     </a:stretch>
@@ -955,7 +1293,7 @@
           <w:szCs w:val="52"/>
         </w:rPr>
         <w:drawing>
-          <wp:inline distT="0" distB="0" distL="0" distR="0" wp14:anchorId="18C09E19" wp14:editId="406CA1B0">
+          <wp:inline distT="0" distB="0" distL="0" distR="0">
             <wp:extent cx="5731510" cy="2225040"/>
             <wp:effectExtent l="0" t="0" r="2540" b="3810"/>
             <wp:docPr id="664556678" name="Picture 1"/>
@@ -966,11 +1304,13 @@
               <a:graphicData uri="http://schemas.openxmlformats.org/drawingml/2006/picture">
                 <pic:pic xmlns:pic="http://schemas.openxmlformats.org/drawingml/2006/picture">
                   <pic:nvPicPr>
-                    <pic:cNvPr id="664556678" name=""/>
-                    <pic:cNvPicPr/>
+                    <pic:cNvPr id="664556678" name="Picture 1"/>
+                    <pic:cNvPicPr>
+                      <a:picLocks noChangeAspect="1"/>
+                    </pic:cNvPicPr>
                   </pic:nvPicPr>
                   <pic:blipFill>
-                    <a:blip r:embed="rId19"/>
+                    <a:blip r:embed="rId25"/>
                     <a:stretch>
                       <a:fillRect/>
                     </a:stretch>
@@ -1018,7 +1358,7 @@
           <w:szCs w:val="52"/>
         </w:rPr>
         <w:drawing>
-          <wp:inline distT="0" distB="0" distL="0" distR="0" wp14:anchorId="0801D7A4" wp14:editId="77747C54">
+          <wp:inline distT="0" distB="0" distL="0" distR="0">
             <wp:extent cx="5731510" cy="2714625"/>
             <wp:effectExtent l="0" t="0" r="2540" b="9525"/>
             <wp:docPr id="1060418502" name="Picture 1"/>
@@ -1029,11 +1369,13 @@
               <a:graphicData uri="http://schemas.openxmlformats.org/drawingml/2006/picture">
                 <pic:pic xmlns:pic="http://schemas.openxmlformats.org/drawingml/2006/picture">
                   <pic:nvPicPr>
-                    <pic:cNvPr id="1060418502" name=""/>
-                    <pic:cNvPicPr/>
+                    <pic:cNvPr id="1060418502" name="Picture 1"/>
+                    <pic:cNvPicPr>
+                      <a:picLocks noChangeAspect="1"/>
+                    </pic:cNvPicPr>
                   </pic:nvPicPr>
                   <pic:blipFill>
-                    <a:blip r:embed="rId20"/>
+                    <a:blip r:embed="rId26"/>
                     <a:stretch>
                       <a:fillRect/>
                     </a:stretch>
@@ -1071,7 +1413,7 @@
           <w:szCs w:val="52"/>
         </w:rPr>
         <w:drawing>
-          <wp:inline distT="0" distB="0" distL="0" distR="0" wp14:anchorId="53233684" wp14:editId="37F57DDD">
+          <wp:inline distT="0" distB="0" distL="0" distR="0">
             <wp:extent cx="5731510" cy="2722880"/>
             <wp:effectExtent l="0" t="0" r="2540" b="1270"/>
             <wp:docPr id="1566509948" name="Picture 1"/>
@@ -1082,11 +1424,13 @@
               <a:graphicData uri="http://schemas.openxmlformats.org/drawingml/2006/picture">
                 <pic:pic xmlns:pic="http://schemas.openxmlformats.org/drawingml/2006/picture">
                   <pic:nvPicPr>
-                    <pic:cNvPr id="1566509948" name=""/>
-                    <pic:cNvPicPr/>
+                    <pic:cNvPr id="1566509948" name="Picture 1"/>
+                    <pic:cNvPicPr>
+                      <a:picLocks noChangeAspect="1"/>
+                    </pic:cNvPicPr>
                   </pic:nvPicPr>
                   <pic:blipFill>
-                    <a:blip r:embed="rId21"/>
+                    <a:blip r:embed="rId27"/>
                     <a:stretch>
                       <a:fillRect/>
                     </a:stretch>
@@ -1193,7 +1537,7 @@
           <w:szCs w:val="52"/>
         </w:rPr>
         <w:drawing>
-          <wp:inline distT="0" distB="0" distL="0" distR="0" wp14:anchorId="397719A3" wp14:editId="37B768BA">
+          <wp:inline distT="0" distB="0" distL="0" distR="0">
             <wp:extent cx="5731510" cy="2715260"/>
             <wp:effectExtent l="0" t="0" r="2540" b="8890"/>
             <wp:docPr id="2087538147" name="Picture 1"/>
@@ -1204,11 +1548,13 @@
               <a:graphicData uri="http://schemas.openxmlformats.org/drawingml/2006/picture">
                 <pic:pic xmlns:pic="http://schemas.openxmlformats.org/drawingml/2006/picture">
                   <pic:nvPicPr>
-                    <pic:cNvPr id="2087538147" name=""/>
-                    <pic:cNvPicPr/>
+                    <pic:cNvPr id="2087538147" name="Picture 1"/>
+                    <pic:cNvPicPr>
+                      <a:picLocks noChangeAspect="1"/>
+                    </pic:cNvPicPr>
                   </pic:nvPicPr>
                   <pic:blipFill>
-                    <a:blip r:embed="rId22"/>
+                    <a:blip r:embed="rId28"/>
                     <a:stretch>
                       <a:fillRect/>
                     </a:stretch>
@@ -1246,7 +1592,7 @@
           <w:szCs w:val="52"/>
         </w:rPr>
         <w:drawing>
-          <wp:inline distT="0" distB="0" distL="0" distR="0" wp14:anchorId="6C4F82CC" wp14:editId="315C2F43">
+          <wp:inline distT="0" distB="0" distL="0" distR="0">
             <wp:extent cx="5731510" cy="2732405"/>
             <wp:effectExtent l="0" t="0" r="2540" b="0"/>
             <wp:docPr id="1482451320" name="Picture 1"/>
@@ -1257,11 +1603,13 @@
               <a:graphicData uri="http://schemas.openxmlformats.org/drawingml/2006/picture">
                 <pic:pic xmlns:pic="http://schemas.openxmlformats.org/drawingml/2006/picture">
                   <pic:nvPicPr>
-                    <pic:cNvPr id="1482451320" name=""/>
-                    <pic:cNvPicPr/>
+                    <pic:cNvPr id="1482451320" name="Picture 1"/>
+                    <pic:cNvPicPr>
+                      <a:picLocks noChangeAspect="1"/>
+                    </pic:cNvPicPr>
                   </pic:nvPicPr>
                   <pic:blipFill>
-                    <a:blip r:embed="rId23"/>
+                    <a:blip r:embed="rId29"/>
                     <a:stretch>
                       <a:fillRect/>
                     </a:stretch>
@@ -1348,7 +1696,7 @@
           <w:szCs w:val="52"/>
         </w:rPr>
         <w:drawing>
-          <wp:inline distT="0" distB="0" distL="0" distR="0" wp14:anchorId="4EAAC2BB" wp14:editId="6E8D9020">
+          <wp:inline distT="0" distB="0" distL="0" distR="0">
             <wp:extent cx="5731510" cy="2912110"/>
             <wp:effectExtent l="0" t="0" r="2540" b="2540"/>
             <wp:docPr id="858824647" name="Picture 1"/>
@@ -1359,11 +1707,13 @@
               <a:graphicData uri="http://schemas.openxmlformats.org/drawingml/2006/picture">
                 <pic:pic xmlns:pic="http://schemas.openxmlformats.org/drawingml/2006/picture">
                   <pic:nvPicPr>
-                    <pic:cNvPr id="858824647" name=""/>
-                    <pic:cNvPicPr/>
+                    <pic:cNvPr id="858824647" name="Picture 1"/>
+                    <pic:cNvPicPr>
+                      <a:picLocks noChangeAspect="1"/>
+                    </pic:cNvPicPr>
                   </pic:nvPicPr>
                   <pic:blipFill>
-                    <a:blip r:embed="rId24"/>
+                    <a:blip r:embed="rId30"/>
                     <a:stretch>
                       <a:fillRect/>
                     </a:stretch>
@@ -1429,25 +1779,7 @@
           <w:sz w:val="40"/>
           <w:szCs w:val="40"/>
         </w:rPr>
-        <w:t>Admin activities – officer,</w:t>
-      </w:r>
-      <w:r>
-        <w:rPr>
-          <w:b/>
-          <w:bCs/>
-          <w:sz w:val="40"/>
-          <w:szCs w:val="40"/>
-        </w:rPr>
-        <w:t xml:space="preserve"> </w:t>
-      </w:r>
-      <w:r>
-        <w:rPr>
-          <w:b/>
-          <w:bCs/>
-          <w:sz w:val="40"/>
-          <w:szCs w:val="40"/>
-        </w:rPr>
-        <w:t>customer Management</w:t>
+        <w:t>Admin activities – officer, customer Management</w:t>
       </w:r>
     </w:p>
     <w:p>
@@ -1467,7 +1799,7 @@
           <w:szCs w:val="52"/>
         </w:rPr>
         <w:drawing>
-          <wp:inline distT="0" distB="0" distL="0" distR="0" wp14:anchorId="789C3722" wp14:editId="1E8125A9">
+          <wp:inline distT="0" distB="0" distL="0" distR="0">
             <wp:extent cx="5731510" cy="2780030"/>
             <wp:effectExtent l="0" t="0" r="2540" b="1270"/>
             <wp:docPr id="2054119011" name="Picture 1"/>
@@ -1478,11 +1810,13 @@
               <a:graphicData uri="http://schemas.openxmlformats.org/drawingml/2006/picture">
                 <pic:pic xmlns:pic="http://schemas.openxmlformats.org/drawingml/2006/picture">
                   <pic:nvPicPr>
-                    <pic:cNvPr id="2054119011" name=""/>
-                    <pic:cNvPicPr/>
+                    <pic:cNvPr id="2054119011" name="Picture 1"/>
+                    <pic:cNvPicPr>
+                      <a:picLocks noChangeAspect="1"/>
+                    </pic:cNvPicPr>
                   </pic:nvPicPr>
                   <pic:blipFill>
-                    <a:blip r:embed="rId25"/>
+                    <a:blip r:embed="rId31"/>
                     <a:stretch>
                       <a:fillRect/>
                     </a:stretch>
@@ -1519,9 +1853,8 @@
           <w:sz w:val="52"/>
           <w:szCs w:val="52"/>
         </w:rPr>
-        <w:lastRenderedPageBreak/>
         <w:drawing>
-          <wp:inline distT="0" distB="0" distL="0" distR="0" wp14:anchorId="62D28C1B" wp14:editId="0DF190FB">
+          <wp:inline distT="0" distB="0" distL="0" distR="0">
             <wp:extent cx="5731510" cy="2776855"/>
             <wp:effectExtent l="0" t="0" r="2540" b="4445"/>
             <wp:docPr id="1555157429" name="Picture 1"/>
@@ -1532,11 +1865,13 @@
               <a:graphicData uri="http://schemas.openxmlformats.org/drawingml/2006/picture">
                 <pic:pic xmlns:pic="http://schemas.openxmlformats.org/drawingml/2006/picture">
                   <pic:nvPicPr>
-                    <pic:cNvPr id="1555157429" name=""/>
-                    <pic:cNvPicPr/>
+                    <pic:cNvPr id="1555157429" name="Picture 1"/>
+                    <pic:cNvPicPr>
+                      <a:picLocks noChangeAspect="1"/>
+                    </pic:cNvPicPr>
                   </pic:nvPicPr>
                   <pic:blipFill>
-                    <a:blip r:embed="rId26"/>
+                    <a:blip r:embed="rId32"/>
                     <a:stretch>
                       <a:fillRect/>
                     </a:stretch>
@@ -1574,7 +1909,7 @@
           <w:szCs w:val="52"/>
         </w:rPr>
         <w:drawing>
-          <wp:inline distT="0" distB="0" distL="0" distR="0" wp14:anchorId="49AD25D4" wp14:editId="002F3C98">
+          <wp:inline distT="0" distB="0" distL="0" distR="0">
             <wp:extent cx="5731510" cy="2702560"/>
             <wp:effectExtent l="0" t="0" r="2540" b="2540"/>
             <wp:docPr id="938046215" name="Picture 1"/>
@@ -1585,11 +1920,13 @@
               <a:graphicData uri="http://schemas.openxmlformats.org/drawingml/2006/picture">
                 <pic:pic xmlns:pic="http://schemas.openxmlformats.org/drawingml/2006/picture">
                   <pic:nvPicPr>
-                    <pic:cNvPr id="938046215" name=""/>
-                    <pic:cNvPicPr/>
+                    <pic:cNvPr id="938046215" name="Picture 1"/>
+                    <pic:cNvPicPr>
+                      <a:picLocks noChangeAspect="1"/>
+                    </pic:cNvPicPr>
                   </pic:nvPicPr>
                   <pic:blipFill>
-                    <a:blip r:embed="rId27"/>
+                    <a:blip r:embed="rId33"/>
                     <a:stretch>
                       <a:fillRect/>
                     </a:stretch>
@@ -1627,7 +1964,7 @@
           <w:szCs w:val="52"/>
         </w:rPr>
         <w:drawing>
-          <wp:inline distT="0" distB="0" distL="0" distR="0" wp14:anchorId="32F3EBEE" wp14:editId="73C35CF0">
+          <wp:inline distT="0" distB="0" distL="0" distR="0">
             <wp:extent cx="5731510" cy="2730500"/>
             <wp:effectExtent l="0" t="0" r="2540" b="0"/>
             <wp:docPr id="1460053500" name="Picture 1"/>
@@ -1638,11 +1975,13 @@
               <a:graphicData uri="http://schemas.openxmlformats.org/drawingml/2006/picture">
                 <pic:pic xmlns:pic="http://schemas.openxmlformats.org/drawingml/2006/picture">
                   <pic:nvPicPr>
-                    <pic:cNvPr id="1460053500" name=""/>
-                    <pic:cNvPicPr/>
+                    <pic:cNvPr id="1460053500" name="Picture 1"/>
+                    <pic:cNvPicPr>
+                      <a:picLocks noChangeAspect="1"/>
+                    </pic:cNvPicPr>
                   </pic:nvPicPr>
                   <pic:blipFill>
-                    <a:blip r:embed="rId28"/>
+                    <a:blip r:embed="rId34"/>
                     <a:stretch>
                       <a:fillRect/>
                     </a:stretch>
@@ -1679,9 +2018,8 @@
           <w:sz w:val="52"/>
           <w:szCs w:val="52"/>
         </w:rPr>
-        <w:lastRenderedPageBreak/>
         <w:drawing>
-          <wp:inline distT="0" distB="0" distL="0" distR="0" wp14:anchorId="5716A45F" wp14:editId="4049337E">
+          <wp:inline distT="0" distB="0" distL="0" distR="0">
             <wp:extent cx="5731510" cy="2783840"/>
             <wp:effectExtent l="0" t="0" r="2540" b="0"/>
             <wp:docPr id="852068478" name="Picture 1"/>
@@ -1692,11 +2030,13 @@
               <a:graphicData uri="http://schemas.openxmlformats.org/drawingml/2006/picture">
                 <pic:pic xmlns:pic="http://schemas.openxmlformats.org/drawingml/2006/picture">
                   <pic:nvPicPr>
-                    <pic:cNvPr id="852068478" name=""/>
-                    <pic:cNvPicPr/>
+                    <pic:cNvPr id="852068478" name="Picture 1"/>
+                    <pic:cNvPicPr>
+                      <a:picLocks noChangeAspect="1"/>
+                    </pic:cNvPicPr>
                   </pic:nvPicPr>
                   <pic:blipFill>
-                    <a:blip r:embed="rId29"/>
+                    <a:blip r:embed="rId35"/>
                     <a:stretch>
                       <a:fillRect/>
                     </a:stretch>
@@ -1734,7 +2074,7 @@
           <w:szCs w:val="52"/>
         </w:rPr>
         <w:drawing>
-          <wp:inline distT="0" distB="0" distL="0" distR="0" wp14:anchorId="2B96AC7E" wp14:editId="2A3F41E8">
+          <wp:inline distT="0" distB="0" distL="0" distR="0">
             <wp:extent cx="5731510" cy="2734310"/>
             <wp:effectExtent l="0" t="0" r="2540" b="8890"/>
             <wp:docPr id="1625509154" name="Picture 1"/>
@@ -1745,11 +2085,13 @@
               <a:graphicData uri="http://schemas.openxmlformats.org/drawingml/2006/picture">
                 <pic:pic xmlns:pic="http://schemas.openxmlformats.org/drawingml/2006/picture">
                   <pic:nvPicPr>
-                    <pic:cNvPr id="1625509154" name=""/>
-                    <pic:cNvPicPr/>
+                    <pic:cNvPr id="1625509154" name="Picture 1"/>
+                    <pic:cNvPicPr>
+                      <a:picLocks noChangeAspect="1"/>
+                    </pic:cNvPicPr>
                   </pic:nvPicPr>
                   <pic:blipFill>
-                    <a:blip r:embed="rId30"/>
+                    <a:blip r:embed="rId36"/>
                     <a:stretch>
                       <a:fillRect/>
                     </a:stretch>
@@ -1787,7 +2129,7 @@
           <w:szCs w:val="52"/>
         </w:rPr>
         <w:drawing>
-          <wp:inline distT="0" distB="0" distL="0" distR="0" wp14:anchorId="553B7B20" wp14:editId="11128612">
+          <wp:inline distT="0" distB="0" distL="0" distR="0">
             <wp:extent cx="5731510" cy="2723515"/>
             <wp:effectExtent l="0" t="0" r="2540" b="635"/>
             <wp:docPr id="89535804" name="Picture 1"/>
@@ -1798,11 +2140,13 @@
               <a:graphicData uri="http://schemas.openxmlformats.org/drawingml/2006/picture">
                 <pic:pic xmlns:pic="http://schemas.openxmlformats.org/drawingml/2006/picture">
                   <pic:nvPicPr>
-                    <pic:cNvPr id="89535804" name=""/>
-                    <pic:cNvPicPr/>
+                    <pic:cNvPr id="89535804" name="Picture 1"/>
+                    <pic:cNvPicPr>
+                      <a:picLocks noChangeAspect="1"/>
+                    </pic:cNvPicPr>
                   </pic:nvPicPr>
                   <pic:blipFill>
-                    <a:blip r:embed="rId31"/>
+                    <a:blip r:embed="rId37"/>
                     <a:stretch>
                       <a:fillRect/>
                     </a:stretch>
@@ -1839,7 +2183,6 @@
           <w:sz w:val="52"/>
           <w:szCs w:val="52"/>
         </w:rPr>
-        <w:lastRenderedPageBreak/>
         <w:t>Force change password for admin created users</w:t>
       </w:r>
       <w:r>
@@ -1850,7 +2193,7 @@
           <w:szCs w:val="52"/>
         </w:rPr>
         <w:drawing>
-          <wp:inline distT="0" distB="0" distL="0" distR="0" wp14:anchorId="6745D574" wp14:editId="517979CB">
+          <wp:inline distT="0" distB="0" distL="0" distR="0">
             <wp:extent cx="5731510" cy="2897505"/>
             <wp:effectExtent l="0" t="0" r="2540" b="0"/>
             <wp:docPr id="1879469619" name="Picture 1"/>
@@ -1861,11 +2204,13 @@
               <a:graphicData uri="http://schemas.openxmlformats.org/drawingml/2006/picture">
                 <pic:pic xmlns:pic="http://schemas.openxmlformats.org/drawingml/2006/picture">
                   <pic:nvPicPr>
-                    <pic:cNvPr id="1879469619" name=""/>
-                    <pic:cNvPicPr/>
+                    <pic:cNvPr id="1879469619" name="Picture 1"/>
+                    <pic:cNvPicPr>
+                      <a:picLocks noChangeAspect="1"/>
+                    </pic:cNvPicPr>
                   </pic:nvPicPr>
                   <pic:blipFill>
-                    <a:blip r:embed="rId32"/>
+                    <a:blip r:embed="rId38"/>
                     <a:stretch>
                       <a:fillRect/>
                     </a:stretch>
@@ -1902,27 +2247,7 @@
           <w:sz w:val="52"/>
           <w:szCs w:val="52"/>
         </w:rPr>
-        <w:t xml:space="preserve">Forceful -profile </w:t>
-      </w:r>
-      <w:proofErr w:type="spellStart"/>
-      <w:r>
-        <w:rPr>
-          <w:b/>
-          <w:bCs/>
-          <w:sz w:val="52"/>
-          <w:szCs w:val="52"/>
-        </w:rPr>
-        <w:t>updation</w:t>
-      </w:r>
-      <w:proofErr w:type="spellEnd"/>
-      <w:r>
-        <w:rPr>
-          <w:b/>
-          <w:bCs/>
-          <w:sz w:val="52"/>
-          <w:szCs w:val="52"/>
-        </w:rPr>
-        <w:t xml:space="preserve"> before loan application</w:t>
+        <w:t>Forceful -profile updation before loan application</w:t>
       </w:r>
     </w:p>
     <w:p>
@@ -1942,7 +2267,7 @@
           <w:szCs w:val="52"/>
         </w:rPr>
         <w:drawing>
-          <wp:inline distT="0" distB="0" distL="0" distR="0" wp14:anchorId="4444A095" wp14:editId="6E267027">
+          <wp:inline distT="0" distB="0" distL="0" distR="0">
             <wp:extent cx="5731510" cy="2646045"/>
             <wp:effectExtent l="0" t="0" r="2540" b="1905"/>
             <wp:docPr id="394367756" name="Picture 1"/>
@@ -1953,11 +2278,13 @@
               <a:graphicData uri="http://schemas.openxmlformats.org/drawingml/2006/picture">
                 <pic:pic xmlns:pic="http://schemas.openxmlformats.org/drawingml/2006/picture">
                   <pic:nvPicPr>
-                    <pic:cNvPr id="394367756" name=""/>
-                    <pic:cNvPicPr/>
+                    <pic:cNvPr id="394367756" name="Picture 1"/>
+                    <pic:cNvPicPr>
+                      <a:picLocks noChangeAspect="1"/>
+                    </pic:cNvPicPr>
                   </pic:nvPicPr>
                   <pic:blipFill>
-                    <a:blip r:embed="rId33"/>
+                    <a:blip r:embed="rId39"/>
                     <a:stretch>
                       <a:fillRect/>
                     </a:stretch>
@@ -1992,34 +2319,34 @@
       <w:pgSz w:w="11906" w:h="16838"/>
       <w:pgMar w:top="1440" w:right="1440" w:bottom="1440" w:left="1440" w:header="567" w:footer="708" w:gutter="0"/>
       <w:pgBorders w:offsetFrom="page">
-        <w:top w:val="single" w:sz="4" w:space="24" w:color="auto"/>
-        <w:left w:val="single" w:sz="4" w:space="24" w:color="auto"/>
-        <w:bottom w:val="single" w:sz="4" w:space="24" w:color="auto"/>
-        <w:right w:val="single" w:sz="4" w:space="24" w:color="auto"/>
+        <w:top w:val="single" w:color="auto" w:sz="4" w:space="24"/>
+        <w:left w:val="single" w:color="auto" w:sz="4" w:space="24"/>
+        <w:bottom w:val="single" w:color="auto" w:sz="4" w:space="24"/>
+        <w:right w:val="single" w:color="auto" w:sz="4" w:space="24"/>
       </w:pgBorders>
-      <w:cols w:space="708"/>
-      <w:docGrid w:linePitch="360"/>
+      <w:cols w:space="708" w:num="1"/>
+      <w:docGrid w:linePitch="360" w:charSpace="0"/>
     </w:sectPr>
   </w:body>
 </w:document>
 </file>
 
 <file path=word/endnotes.xml><?xml version="1.0" encoding="utf-8"?>
-<w:endnotes xmlns:wpc="http://schemas.microsoft.com/office/word/2010/wordprocessingCanvas" xmlns:cx="http://schemas.microsoft.com/office/drawing/2014/chartex" xmlns:cx1="http://schemas.microsoft.com/office/drawing/2015/9/8/chartex" xmlns:cx2="http://schemas.microsoft.com/office/drawing/2015/10/21/chartex" xmlns:cx3="http://schemas.microsoft.com/office/drawing/2016/5/9/chartex" xmlns:cx4="http://schemas.microsoft.com/office/drawing/2016/5/10/chartex" xmlns:cx5="http://schemas.microsoft.com/office/drawing/2016/5/11/chartex" xmlns:cx6="http://schemas.microsoft.com/office/drawing/2016/5/12/chartex" xmlns:cx7="http://schemas.microsoft.com/office/drawing/2016/5/13/chartex" xmlns:cx8="http://schemas.microsoft.com/office/drawing/2016/5/14/chartex" xmlns:mc="http://schemas.openxmlformats.org/markup-compatibility/2006" xmlns:aink="http://schemas.microsoft.com/office/drawing/2016/ink" xmlns:am3d="http://schemas.microsoft.com/office/drawing/2017/model3d" xmlns:o="urn:schemas-microsoft-com:office:office" xmlns:oel="http://schemas.microsoft.com/office/2019/extlst" xmlns:r="http://schemas.openxmlformats.org/officeDocument/2006/relationships" xmlns:m="http://schemas.openxmlformats.org/officeDocument/2006/math" xmlns:v="urn:schemas-microsoft-com:vml" xmlns:wp14="http://schemas.microsoft.com/office/word/2010/wordprocessingDrawing" xmlns:wp="http://schemas.openxmlformats.org/drawingml/2006/wordprocessingDrawing" xmlns:w10="urn:schemas-microsoft-com:office:word" xmlns:w="http://schemas.openxmlformats.org/wordprocessingml/2006/main" xmlns:w14="http://schemas.microsoft.com/office/word/2010/wordml" xmlns:w15="http://schemas.microsoft.com/office/word/2012/wordml" xmlns:w16cex="http://schemas.microsoft.com/office/word/2018/wordml/cex" xmlns:w16cid="http://schemas.microsoft.com/office/word/2016/wordml/cid" xmlns:w16="http://schemas.microsoft.com/office/word/2018/wordml" xmlns:w16du="http://schemas.microsoft.com/office/word/2023/wordml/word16du" xmlns:w16sdtdh="http://schemas.microsoft.com/office/word/2020/wordml/sdtdatahash" xmlns:w16sdtfl="http://schemas.microsoft.com/office/word/2024/wordml/sdtformatlock" xmlns:w16se="http://schemas.microsoft.com/office/word/2015/wordml/symex" xmlns:wpg="http://schemas.microsoft.com/office/word/2010/wordprocessingGroup" xmlns:wpi="http://schemas.microsoft.com/office/word/2010/wordprocessingInk" xmlns:wne="http://schemas.microsoft.com/office/word/2006/wordml" xmlns:wps="http://schemas.microsoft.com/office/word/2010/wordprocessingShape" mc:Ignorable="w14 w15 w16se w16cid w16 w16cex w16sdtdh w16sdtfl w16du wp14">
-  <w:endnote w:type="separator" w:id="-1">
-    <w:p>
-      <w:pPr>
-        <w:spacing w:after="0" w:line="240" w:lineRule="auto"/>
+<w:endnotes xmlns:wpc="http://schemas.microsoft.com/office/word/2010/wordprocessingCanvas" xmlns:mc="http://schemas.openxmlformats.org/markup-compatibility/2006" xmlns:o="urn:schemas-microsoft-com:office:office" xmlns:r="http://schemas.openxmlformats.org/officeDocument/2006/relationships" xmlns:m="http://schemas.openxmlformats.org/officeDocument/2006/math" xmlns:v="urn:schemas-microsoft-com:vml" xmlns:wp14="http://schemas.microsoft.com/office/word/2010/wordprocessingDrawing" xmlns:wp="http://schemas.openxmlformats.org/drawingml/2006/wordprocessingDrawing" xmlns:w="http://schemas.openxmlformats.org/wordprocessingml/2006/main" xmlns:w14="http://schemas.microsoft.com/office/word/2010/wordml" xmlns:w15="http://schemas.microsoft.com/office/word/2012/wordml" xmlns:w10="urn:schemas-microsoft-com:office:word" xmlns:wpg="http://schemas.microsoft.com/office/word/2010/wordprocessingGroup" xmlns:wpi="http://schemas.microsoft.com/office/word/2010/wordprocessingInk" xmlns:wne="http://schemas.microsoft.com/office/word/2006/wordml" xmlns:wps="http://schemas.microsoft.com/office/word/2010/wordprocessingShape" xmlns:wpsCustomData="http://www.wps.cn/officeDocument/2013/wpsCustomData" mc:Ignorable="w14 w15 wp14">
+  <w:endnote w:type="separator" w:id="0">
+    <w:p>
+      <w:pPr>
+        <w:spacing w:line="240" w:lineRule="auto"/>
       </w:pPr>
       <w:r>
         <w:separator/>
       </w:r>
     </w:p>
   </w:endnote>
-  <w:endnote w:type="continuationSeparator" w:id="0">
-    <w:p>
-      <w:pPr>
-        <w:spacing w:after="0" w:line="240" w:lineRule="auto"/>
+  <w:endnote w:type="continuationSeparator" w:id="1">
+    <w:p>
+      <w:pPr>
+        <w:spacing w:line="240" w:lineRule="auto"/>
       </w:pPr>
       <w:r>
         <w:continuationSeparator/>
@@ -2030,21 +2357,21 @@
 </file>
 
 <file path=word/footnotes.xml><?xml version="1.0" encoding="utf-8"?>
-<w:footnotes xmlns:wpc="http://schemas.microsoft.com/office/word/2010/wordprocessingCanvas" xmlns:cx="http://schemas.microsoft.com/office/drawing/2014/chartex" xmlns:cx1="http://schemas.microsoft.com/office/drawing/2015/9/8/chartex" xmlns:cx2="http://schemas.microsoft.com/office/drawing/2015/10/21/chartex" xmlns:cx3="http://schemas.microsoft.com/office/drawing/2016/5/9/chartex" xmlns:cx4="http://schemas.microsoft.com/office/drawing/2016/5/10/chartex" xmlns:cx5="http://schemas.microsoft.com/office/drawing/2016/5/11/chartex" xmlns:cx6="http://schemas.microsoft.com/office/drawing/2016/5/12/chartex" xmlns:cx7="http://schemas.microsoft.com/office/drawing/2016/5/13/chartex" xmlns:cx8="http://schemas.microsoft.com/office/drawing/2016/5/14/chartex" xmlns:mc="http://schemas.openxmlformats.org/markup-compatibility/2006" xmlns:aink="http://schemas.microsoft.com/office/drawing/2016/ink" xmlns:am3d="http://schemas.microsoft.com/office/drawing/2017/model3d" xmlns:o="urn:schemas-microsoft-com:office:office" xmlns:oel="http://schemas.microsoft.com/office/2019/extlst" xmlns:r="http://schemas.openxmlformats.org/officeDocument/2006/relationships" xmlns:m="http://schemas.openxmlformats.org/officeDocument/2006/math" xmlns:v="urn:schemas-microsoft-com:vml" xmlns:wp14="http://schemas.microsoft.com/office/word/2010/wordprocessingDrawing" xmlns:wp="http://schemas.openxmlformats.org/drawingml/2006/wordprocessingDrawing" xmlns:w10="urn:schemas-microsoft-com:office:word" xmlns:w="http://schemas.openxmlformats.org/wordprocessingml/2006/main" xmlns:w14="http://schemas.microsoft.com/office/word/2010/wordml" xmlns:w15="http://schemas.microsoft.com/office/word/2012/wordml" xmlns:w16cex="http://schemas.microsoft.com/office/word/2018/wordml/cex" xmlns:w16cid="http://schemas.microsoft.com/office/word/2016/wordml/cid" xmlns:w16="http://schemas.microsoft.com/office/word/2018/wordml" xmlns:w16du="http://schemas.microsoft.com/office/word/2023/wordml/word16du" xmlns:w16sdtdh="http://schemas.microsoft.com/office/word/2020/wordml/sdtdatahash" xmlns:w16sdtfl="http://schemas.microsoft.com/office/word/2024/wordml/sdtformatlock" xmlns:w16se="http://schemas.microsoft.com/office/word/2015/wordml/symex" xmlns:wpg="http://schemas.microsoft.com/office/word/2010/wordprocessingGroup" xmlns:wpi="http://schemas.microsoft.com/office/word/2010/wordprocessingInk" xmlns:wne="http://schemas.microsoft.com/office/word/2006/wordml" xmlns:wps="http://schemas.microsoft.com/office/word/2010/wordprocessingShape" mc:Ignorable="w14 w15 w16se w16cid w16 w16cex w16sdtdh w16sdtfl w16du wp14">
-  <w:footnote w:type="separator" w:id="-1">
-    <w:p>
-      <w:pPr>
-        <w:spacing w:after="0" w:line="240" w:lineRule="auto"/>
+<w:footnotes xmlns:wpc="http://schemas.microsoft.com/office/word/2010/wordprocessingCanvas" xmlns:mc="http://schemas.openxmlformats.org/markup-compatibility/2006" xmlns:o="urn:schemas-microsoft-com:office:office" xmlns:r="http://schemas.openxmlformats.org/officeDocument/2006/relationships" xmlns:m="http://schemas.openxmlformats.org/officeDocument/2006/math" xmlns:v="urn:schemas-microsoft-com:vml" xmlns:wp14="http://schemas.microsoft.com/office/word/2010/wordprocessingDrawing" xmlns:wp="http://schemas.openxmlformats.org/drawingml/2006/wordprocessingDrawing" xmlns:w="http://schemas.openxmlformats.org/wordprocessingml/2006/main" xmlns:w14="http://schemas.microsoft.com/office/word/2010/wordml" xmlns:w15="http://schemas.microsoft.com/office/word/2012/wordml" xmlns:w10="urn:schemas-microsoft-com:office:word" xmlns:wpg="http://schemas.microsoft.com/office/word/2010/wordprocessingGroup" xmlns:wpi="http://schemas.microsoft.com/office/word/2010/wordprocessingInk" xmlns:wne="http://schemas.microsoft.com/office/word/2006/wordml" xmlns:wps="http://schemas.microsoft.com/office/word/2010/wordprocessingShape" xmlns:wpsCustomData="http://www.wps.cn/officeDocument/2013/wpsCustomData" mc:Ignorable="w14 w15 wp14">
+  <w:footnote w:type="separator" w:id="0">
+    <w:p>
+      <w:pPr>
+        <w:spacing w:before="0" w:after="0" w:line="278" w:lineRule="auto"/>
       </w:pPr>
       <w:r>
         <w:separator/>
       </w:r>
     </w:p>
   </w:footnote>
-  <w:footnote w:type="continuationSeparator" w:id="0">
-    <w:p>
-      <w:pPr>
-        <w:spacing w:after="0" w:line="240" w:lineRule="auto"/>
+  <w:footnote w:type="continuationSeparator" w:id="1">
+    <w:p>
+      <w:pPr>
+        <w:spacing w:before="0" w:after="0" w:line="278" w:lineRule="auto"/>
       </w:pPr>
       <w:r>
         <w:continuationSeparator/>
@@ -2055,414 +2382,291 @@
 </file>
 
 <file path=word/styles.xml><?xml version="1.0" encoding="utf-8"?>
-<w:styles xmlns:mc="http://schemas.openxmlformats.org/markup-compatibility/2006" xmlns:r="http://schemas.openxmlformats.org/officeDocument/2006/relationships" xmlns:w="http://schemas.openxmlformats.org/wordprocessingml/2006/main" xmlns:w14="http://schemas.microsoft.com/office/word/2010/wordml" xmlns:w15="http://schemas.microsoft.com/office/word/2012/wordml" xmlns:w16cex="http://schemas.microsoft.com/office/word/2018/wordml/cex" xmlns:w16cid="http://schemas.microsoft.com/office/word/2016/wordml/cid" xmlns:w16="http://schemas.microsoft.com/office/word/2018/wordml" xmlns:w16du="http://schemas.microsoft.com/office/word/2023/wordml/word16du" xmlns:w16sdtdh="http://schemas.microsoft.com/office/word/2020/wordml/sdtdatahash" xmlns:w16sdtfl="http://schemas.microsoft.com/office/word/2024/wordml/sdtformatlock" xmlns:w16se="http://schemas.microsoft.com/office/word/2015/wordml/symex" mc:Ignorable="w14 w15 w16se w16cid w16 w16cex w16sdtdh w16sdtfl w16du">
+<w:styles xmlns:mc="http://schemas.openxmlformats.org/markup-compatibility/2006" xmlns:o="urn:schemas-microsoft-com:office:office" xmlns:r="http://schemas.openxmlformats.org/officeDocument/2006/relationships" xmlns:m="http://schemas.openxmlformats.org/officeDocument/2006/math" xmlns:v="urn:schemas-microsoft-com:vml" xmlns:w="http://schemas.openxmlformats.org/wordprocessingml/2006/main" xmlns:w14="http://schemas.microsoft.com/office/word/2010/wordml" xmlns:w10="urn:schemas-microsoft-com:office:word" xmlns:sl="http://schemas.openxmlformats.org/schemaLibrary/2006/main" xmlns:wpsCustomData="http://www.wps.cn/officeDocument/2013/wpsCustomData" mc:Ignorable="w14">
   <w:docDefaults>
     <w:rPrDefault>
       <w:rPr>
-        <w:rFonts w:asciiTheme="minorHAnsi" w:eastAsiaTheme="minorHAnsi" w:hAnsiTheme="minorHAnsi" w:cstheme="minorBidi"/>
-        <w:kern w:val="2"/>
-        <w:sz w:val="24"/>
-        <w:szCs w:val="24"/>
-        <w:lang w:val="en-IN" w:eastAsia="en-US" w:bidi="ar-SA"/>
-        <w14:ligatures w14:val="standardContextual"/>
+        <w:rFonts w:asciiTheme="minorHAnsi" w:hAnsiTheme="minorHAnsi" w:eastAsiaTheme="minorHAnsi" w:cstheme="minorBidi"/>
       </w:rPr>
     </w:rPrDefault>
-    <w:pPrDefault>
-      <w:pPr>
-        <w:spacing w:after="160" w:line="278" w:lineRule="auto"/>
-      </w:pPr>
-    </w:pPrDefault>
+    <w:pPrDefault/>
   </w:docDefaults>
-  <w:latentStyles w:defLockedState="0" w:defUIPriority="99" w:defSemiHidden="0" w:defUnhideWhenUsed="0" w:defQFormat="0" w:count="376">
-    <w:lsdException w:name="Normal" w:uiPriority="0" w:qFormat="1"/>
-    <w:lsdException w:name="heading 1" w:uiPriority="9" w:qFormat="1"/>
-    <w:lsdException w:name="heading 2" w:semiHidden="1" w:uiPriority="9" w:unhideWhenUsed="1" w:qFormat="1"/>
-    <w:lsdException w:name="heading 3" w:semiHidden="1" w:uiPriority="9" w:unhideWhenUsed="1" w:qFormat="1"/>
-    <w:lsdException w:name="heading 4" w:semiHidden="1" w:uiPriority="9" w:unhideWhenUsed="1" w:qFormat="1"/>
-    <w:lsdException w:name="heading 5" w:semiHidden="1" w:uiPriority="9" w:unhideWhenUsed="1" w:qFormat="1"/>
-    <w:lsdException w:name="heading 6" w:semiHidden="1" w:uiPriority="9" w:unhideWhenUsed="1" w:qFormat="1"/>
-    <w:lsdException w:name="heading 7" w:semiHidden="1" w:uiPriority="9" w:unhideWhenUsed="1" w:qFormat="1"/>
-    <w:lsdException w:name="heading 8" w:semiHidden="1" w:uiPriority="9" w:unhideWhenUsed="1" w:qFormat="1"/>
-    <w:lsdException w:name="heading 9" w:semiHidden="1" w:uiPriority="9" w:unhideWhenUsed="1" w:qFormat="1"/>
-    <w:lsdException w:name="index 1" w:semiHidden="1" w:unhideWhenUsed="1"/>
-    <w:lsdException w:name="index 2" w:semiHidden="1" w:unhideWhenUsed="1"/>
-    <w:lsdException w:name="index 3" w:semiHidden="1" w:unhideWhenUsed="1"/>
-    <w:lsdException w:name="index 4" w:semiHidden="1" w:unhideWhenUsed="1"/>
-    <w:lsdException w:name="index 5" w:semiHidden="1" w:unhideWhenUsed="1"/>
-    <w:lsdException w:name="index 6" w:semiHidden="1" w:unhideWhenUsed="1"/>
-    <w:lsdException w:name="index 7" w:semiHidden="1" w:unhideWhenUsed="1"/>
-    <w:lsdException w:name="index 8" w:semiHidden="1" w:unhideWhenUsed="1"/>
-    <w:lsdException w:name="index 9" w:semiHidden="1" w:unhideWhenUsed="1"/>
-    <w:lsdException w:name="toc 1" w:semiHidden="1" w:uiPriority="39" w:unhideWhenUsed="1"/>
-    <w:lsdException w:name="toc 2" w:semiHidden="1" w:uiPriority="39" w:unhideWhenUsed="1"/>
-    <w:lsdException w:name="toc 3" w:semiHidden="1" w:uiPriority="39" w:unhideWhenUsed="1"/>
-    <w:lsdException w:name="toc 4" w:semiHidden="1" w:uiPriority="39" w:unhideWhenUsed="1"/>
-    <w:lsdException w:name="toc 5" w:semiHidden="1" w:uiPriority="39" w:unhideWhenUsed="1"/>
-    <w:lsdException w:name="toc 6" w:semiHidden="1" w:uiPriority="39" w:unhideWhenUsed="1"/>
-    <w:lsdException w:name="toc 7" w:semiHidden="1" w:uiPriority="39" w:unhideWhenUsed="1"/>
-    <w:lsdException w:name="toc 8" w:semiHidden="1" w:uiPriority="39" w:unhideWhenUsed="1"/>
-    <w:lsdException w:name="toc 9" w:semiHidden="1" w:uiPriority="39" w:unhideWhenUsed="1"/>
-    <w:lsdException w:name="Normal Indent" w:semiHidden="1" w:unhideWhenUsed="1"/>
-    <w:lsdException w:name="footnote text" w:semiHidden="1" w:unhideWhenUsed="1"/>
-    <w:lsdException w:name="annotation text" w:semiHidden="1" w:unhideWhenUsed="1"/>
-    <w:lsdException w:name="header" w:semiHidden="1" w:unhideWhenUsed="1"/>
-    <w:lsdException w:name="footer" w:semiHidden="1" w:unhideWhenUsed="1"/>
-    <w:lsdException w:name="index heading" w:semiHidden="1" w:unhideWhenUsed="1"/>
-    <w:lsdException w:name="caption" w:semiHidden="1" w:uiPriority="35" w:unhideWhenUsed="1" w:qFormat="1"/>
-    <w:lsdException w:name="table of figures" w:semiHidden="1" w:unhideWhenUsed="1"/>
-    <w:lsdException w:name="envelope address" w:semiHidden="1" w:unhideWhenUsed="1"/>
-    <w:lsdException w:name="envelope return" w:semiHidden="1" w:unhideWhenUsed="1"/>
-    <w:lsdException w:name="footnote reference" w:semiHidden="1" w:unhideWhenUsed="1"/>
-    <w:lsdException w:name="annotation reference" w:semiHidden="1" w:unhideWhenUsed="1"/>
-    <w:lsdException w:name="line number" w:semiHidden="1" w:unhideWhenUsed="1"/>
-    <w:lsdException w:name="page number" w:semiHidden="1" w:unhideWhenUsed="1"/>
-    <w:lsdException w:name="endnote reference" w:semiHidden="1" w:unhideWhenUsed="1"/>
-    <w:lsdException w:name="endnote text" w:semiHidden="1" w:unhideWhenUsed="1"/>
-    <w:lsdException w:name="table of authorities" w:semiHidden="1" w:unhideWhenUsed="1"/>
-    <w:lsdException w:name="macro" w:semiHidden="1" w:unhideWhenUsed="1"/>
-    <w:lsdException w:name="toa heading" w:semiHidden="1" w:unhideWhenUsed="1"/>
-    <w:lsdException w:name="List" w:semiHidden="1" w:unhideWhenUsed="1"/>
-    <w:lsdException w:name="List Bullet" w:semiHidden="1" w:unhideWhenUsed="1"/>
-    <w:lsdException w:name="List Number" w:semiHidden="1" w:unhideWhenUsed="1"/>
-    <w:lsdException w:name="List 2" w:semiHidden="1" w:unhideWhenUsed="1"/>
-    <w:lsdException w:name="List 3" w:semiHidden="1" w:unhideWhenUsed="1"/>
-    <w:lsdException w:name="List 4" w:semiHidden="1" w:unhideWhenUsed="1"/>
-    <w:lsdException w:name="List 5" w:semiHidden="1" w:unhideWhenUsed="1"/>
-    <w:lsdException w:name="List Bullet 2" w:semiHidden="1" w:unhideWhenUsed="1"/>
-    <w:lsdException w:name="List Bullet 3" w:semiHidden="1" w:unhideWhenUsed="1"/>
-    <w:lsdException w:name="List Bullet 4" w:semiHidden="1" w:unhideWhenUsed="1"/>
-    <w:lsdException w:name="List Bullet 5" w:semiHidden="1" w:unhideWhenUsed="1"/>
-    <w:lsdException w:name="List Number 2" w:semiHidden="1" w:unhideWhenUsed="1"/>
-    <w:lsdException w:name="List Number 3" w:semiHidden="1" w:unhideWhenUsed="1"/>
-    <w:lsdException w:name="List Number 4" w:semiHidden="1" w:unhideWhenUsed="1"/>
-    <w:lsdException w:name="List Number 5" w:semiHidden="1" w:unhideWhenUsed="1"/>
-    <w:lsdException w:name="Title" w:uiPriority="10" w:qFormat="1"/>
-    <w:lsdException w:name="Closing" w:semiHidden="1" w:unhideWhenUsed="1"/>
-    <w:lsdException w:name="Signature" w:semiHidden="1" w:unhideWhenUsed="1"/>
-    <w:lsdException w:name="Default Paragraph Font" w:semiHidden="1" w:uiPriority="1" w:unhideWhenUsed="1"/>
-    <w:lsdException w:name="Body Text" w:semiHidden="1" w:unhideWhenUsed="1"/>
-    <w:lsdException w:name="Body Text Indent" w:semiHidden="1" w:unhideWhenUsed="1"/>
-    <w:lsdException w:name="List Continue" w:semiHidden="1" w:unhideWhenUsed="1"/>
-    <w:lsdException w:name="List Continue 2" w:semiHidden="1" w:unhideWhenUsed="1"/>
-    <w:lsdException w:name="List Continue 3" w:semiHidden="1" w:unhideWhenUsed="1"/>
-    <w:lsdException w:name="List Continue 4" w:semiHidden="1" w:unhideWhenUsed="1"/>
-    <w:lsdException w:name="List Continue 5" w:semiHidden="1" w:unhideWhenUsed="1"/>
-    <w:lsdException w:name="Message Header" w:semiHidden="1" w:unhideWhenUsed="1"/>
-    <w:lsdException w:name="Subtitle" w:uiPriority="11" w:qFormat="1"/>
-    <w:lsdException w:name="Salutation" w:semiHidden="1" w:unhideWhenUsed="1"/>
-    <w:lsdException w:name="Date" w:semiHidden="1" w:unhideWhenUsed="1"/>
-    <w:lsdException w:name="Body Text First Indent" w:semiHidden="1" w:unhideWhenUsed="1"/>
-    <w:lsdException w:name="Body Text First Indent 2" w:semiHidden="1" w:unhideWhenUsed="1"/>
-    <w:lsdException w:name="Note Heading" w:semiHidden="1" w:unhideWhenUsed="1"/>
-    <w:lsdException w:name="Body Text 2" w:semiHidden="1" w:unhideWhenUsed="1"/>
-    <w:lsdException w:name="Body Text 3" w:semiHidden="1" w:unhideWhenUsed="1"/>
-    <w:lsdException w:name="Body Text Indent 2" w:semiHidden="1" w:unhideWhenUsed="1"/>
-    <w:lsdException w:name="Body Text Indent 3" w:semiHidden="1" w:unhideWhenUsed="1"/>
-    <w:lsdException w:name="Block Text" w:semiHidden="1" w:unhideWhenUsed="1"/>
-    <w:lsdException w:name="Hyperlink" w:semiHidden="1" w:unhideWhenUsed="1"/>
-    <w:lsdException w:name="FollowedHyperlink" w:semiHidden="1" w:unhideWhenUsed="1"/>
-    <w:lsdException w:name="Strong" w:uiPriority="22" w:qFormat="1"/>
-    <w:lsdException w:name="Emphasis" w:uiPriority="20" w:qFormat="1"/>
-    <w:lsdException w:name="Document Map" w:semiHidden="1" w:unhideWhenUsed="1"/>
-    <w:lsdException w:name="Plain Text" w:semiHidden="1" w:unhideWhenUsed="1"/>
-    <w:lsdException w:name="E-mail Signature" w:semiHidden="1" w:unhideWhenUsed="1"/>
-    <w:lsdException w:name="HTML Top of Form" w:semiHidden="1" w:unhideWhenUsed="1"/>
-    <w:lsdException w:name="HTML Bottom of Form" w:semiHidden="1" w:unhideWhenUsed="1"/>
-    <w:lsdException w:name="Normal (Web)" w:semiHidden="1" w:unhideWhenUsed="1"/>
-    <w:lsdException w:name="HTML Acronym" w:semiHidden="1" w:unhideWhenUsed="1"/>
-    <w:lsdException w:name="HTML Address" w:semiHidden="1" w:unhideWhenUsed="1"/>
-    <w:lsdException w:name="HTML Cite" w:semiHidden="1" w:unhideWhenUsed="1"/>
-    <w:lsdException w:name="HTML Code" w:semiHidden="1" w:unhideWhenUsed="1"/>
-    <w:lsdException w:name="HTML Definition" w:semiHidden="1" w:unhideWhenUsed="1"/>
-    <w:lsdException w:name="HTML Keyboard" w:semiHidden="1" w:unhideWhenUsed="1"/>
-    <w:lsdException w:name="HTML Preformatted" w:semiHidden="1" w:unhideWhenUsed="1"/>
-    <w:lsdException w:name="HTML Sample" w:semiHidden="1" w:unhideWhenUsed="1"/>
-    <w:lsdException w:name="HTML Typewriter" w:semiHidden="1" w:unhideWhenUsed="1"/>
-    <w:lsdException w:name="HTML Variable" w:semiHidden="1" w:unhideWhenUsed="1"/>
-    <w:lsdException w:name="Normal Table" w:semiHidden="1" w:unhideWhenUsed="1"/>
-    <w:lsdException w:name="annotation subject" w:semiHidden="1" w:unhideWhenUsed="1"/>
-    <w:lsdException w:name="No List" w:semiHidden="1" w:unhideWhenUsed="1"/>
-    <w:lsdException w:name="Outline List 1" w:semiHidden="1" w:unhideWhenUsed="1"/>
-    <w:lsdException w:name="Outline List 2" w:semiHidden="1" w:unhideWhenUsed="1"/>
-    <w:lsdException w:name="Outline List 3" w:semiHidden="1" w:unhideWhenUsed="1"/>
-    <w:lsdException w:name="Table Simple 1" w:semiHidden="1" w:unhideWhenUsed="1"/>
-    <w:lsdException w:name="Table Simple 2" w:semiHidden="1" w:unhideWhenUsed="1"/>
-    <w:lsdException w:name="Table Simple 3" w:semiHidden="1" w:unhideWhenUsed="1"/>
-    <w:lsdException w:name="Table Classic 1" w:semiHidden="1" w:unhideWhenUsed="1"/>
-    <w:lsdException w:name="Table Classic 2" w:semiHidden="1" w:unhideWhenUsed="1"/>
-    <w:lsdException w:name="Table Classic 3" w:semiHidden="1" w:unhideWhenUsed="1"/>
-    <w:lsdException w:name="Table Classic 4" w:semiHidden="1" w:unhideWhenUsed="1"/>
-    <w:lsdException w:name="Table Colorful 1" w:semiHidden="1" w:unhideWhenUsed="1"/>
-    <w:lsdException w:name="Table Colorful 2" w:semiHidden="1" w:unhideWhenUsed="1"/>
-    <w:lsdException w:name="Table Colorful 3" w:semiHidden="1" w:unhideWhenUsed="1"/>
-    <w:lsdException w:name="Table Columns 1" w:semiHidden="1" w:unhideWhenUsed="1"/>
-    <w:lsdException w:name="Table Columns 2" w:semiHidden="1" w:unhideWhenUsed="1"/>
-    <w:lsdException w:name="Table Columns 3" w:semiHidden="1" w:unhideWhenUsed="1"/>
-    <w:lsdException w:name="Table Columns 4" w:semiHidden="1" w:unhideWhenUsed="1"/>
-    <w:lsdException w:name="Table Columns 5" w:semiHidden="1" w:unhideWhenUsed="1"/>
-    <w:lsdException w:name="Table Grid 1" w:semiHidden="1" w:unhideWhenUsed="1"/>
-    <w:lsdException w:name="Table Grid 2" w:semiHidden="1" w:unhideWhenUsed="1"/>
-    <w:lsdException w:name="Table Grid 3" w:semiHidden="1" w:unhideWhenUsed="1"/>
-    <w:lsdException w:name="Table Grid 4" w:semiHidden="1" w:unhideWhenUsed="1"/>
-    <w:lsdException w:name="Table Grid 5" w:semiHidden="1" w:unhideWhenUsed="1"/>
-    <w:lsdException w:name="Table Grid 6" w:semiHidden="1" w:unhideWhenUsed="1"/>
-    <w:lsdException w:name="Table Grid 7" w:semiHidden="1" w:unhideWhenUsed="1"/>
-    <w:lsdException w:name="Table Grid 8" w:semiHidden="1" w:unhideWhenUsed="1"/>
-    <w:lsdException w:name="Table List 1" w:semiHidden="1" w:unhideWhenUsed="1"/>
-    <w:lsdException w:name="Table List 2" w:semiHidden="1" w:unhideWhenUsed="1"/>
-    <w:lsdException w:name="Table List 3" w:semiHidden="1" w:unhideWhenUsed="1"/>
-    <w:lsdException w:name="Table List 4" w:semiHidden="1" w:unhideWhenUsed="1"/>
-    <w:lsdException w:name="Table List 5" w:semiHidden="1" w:unhideWhenUsed="1"/>
-    <w:lsdException w:name="Table List 6" w:semiHidden="1" w:unhideWhenUsed="1"/>
-    <w:lsdException w:name="Table List 7" w:semiHidden="1" w:unhideWhenUsed="1"/>
-    <w:lsdException w:name="Table List 8" w:semiHidden="1" w:unhideWhenUsed="1"/>
-    <w:lsdException w:name="Table 3D effects 1" w:semiHidden="1" w:unhideWhenUsed="1"/>
-    <w:lsdException w:name="Table 3D effects 2" w:semiHidden="1" w:unhideWhenUsed="1"/>
-    <w:lsdException w:name="Table 3D effects 3" w:semiHidden="1" w:unhideWhenUsed="1"/>
-    <w:lsdException w:name="Table Contemporary" w:semiHidden="1" w:unhideWhenUsed="1"/>
-    <w:lsdException w:name="Table Elegant" w:semiHidden="1" w:unhideWhenUsed="1"/>
-    <w:lsdException w:name="Table Professional" w:semiHidden="1" w:unhideWhenUsed="1"/>
-    <w:lsdException w:name="Table Subtle 1" w:semiHidden="1" w:unhideWhenUsed="1"/>
-    <w:lsdException w:name="Table Subtle 2" w:semiHidden="1" w:unhideWhenUsed="1"/>
-    <w:lsdException w:name="Table Web 1" w:semiHidden="1" w:unhideWhenUsed="1"/>
-    <w:lsdException w:name="Table Web 2" w:semiHidden="1" w:unhideWhenUsed="1"/>
-    <w:lsdException w:name="Table Web 3" w:semiHidden="1" w:unhideWhenUsed="1"/>
-    <w:lsdException w:name="Balloon Text" w:semiHidden="1" w:unhideWhenUsed="1"/>
-    <w:lsdException w:name="Table Grid" w:uiPriority="39"/>
-    <w:lsdException w:name="Table Theme" w:semiHidden="1" w:unhideWhenUsed="1"/>
-    <w:lsdException w:name="Placeholder Text" w:semiHidden="1"/>
-    <w:lsdException w:name="No Spacing" w:uiPriority="1" w:qFormat="1"/>
-    <w:lsdException w:name="Light Shading" w:uiPriority="60"/>
-    <w:lsdException w:name="Light List" w:uiPriority="61"/>
-    <w:lsdException w:name="Light Grid" w:uiPriority="62"/>
-    <w:lsdException w:name="Medium Shading 1" w:uiPriority="63"/>
-    <w:lsdException w:name="Medium Shading 2" w:uiPriority="64"/>
-    <w:lsdException w:name="Medium List 1" w:uiPriority="65"/>
-    <w:lsdException w:name="Medium List 2" w:uiPriority="66"/>
-    <w:lsdException w:name="Medium Grid 1" w:uiPriority="67"/>
-    <w:lsdException w:name="Medium Grid 2" w:uiPriority="68"/>
-    <w:lsdException w:name="Medium Grid 3" w:uiPriority="69"/>
-    <w:lsdException w:name="Dark List" w:uiPriority="70"/>
-    <w:lsdException w:name="Colorful Shading" w:uiPriority="71"/>
-    <w:lsdException w:name="Colorful List" w:uiPriority="72"/>
-    <w:lsdException w:name="Colorful Grid" w:uiPriority="73"/>
-    <w:lsdException w:name="Light Shading Accent 1" w:uiPriority="60"/>
-    <w:lsdException w:name="Light List Accent 1" w:uiPriority="61"/>
-    <w:lsdException w:name="Light Grid Accent 1" w:uiPriority="62"/>
-    <w:lsdException w:name="Medium Shading 1 Accent 1" w:uiPriority="63"/>
-    <w:lsdException w:name="Medium Shading 2 Accent 1" w:uiPriority="64"/>
-    <w:lsdException w:name="Medium List 1 Accent 1" w:uiPriority="65"/>
-    <w:lsdException w:name="Revision" w:semiHidden="1"/>
-    <w:lsdException w:name="List Paragraph" w:uiPriority="34" w:qFormat="1"/>
-    <w:lsdException w:name="Quote" w:uiPriority="29" w:qFormat="1"/>
-    <w:lsdException w:name="Intense Quote" w:uiPriority="30" w:qFormat="1"/>
-    <w:lsdException w:name="Medium List 2 Accent 1" w:uiPriority="66"/>
-    <w:lsdException w:name="Medium Grid 1 Accent 1" w:uiPriority="67"/>
-    <w:lsdException w:name="Medium Grid 2 Accent 1" w:uiPriority="68"/>
-    <w:lsdException w:name="Medium Grid 3 Accent 1" w:uiPriority="69"/>
-    <w:lsdException w:name="Dark List Accent 1" w:uiPriority="70"/>
-    <w:lsdException w:name="Colorful Shading Accent 1" w:uiPriority="71"/>
-    <w:lsdException w:name="Colorful List Accent 1" w:uiPriority="72"/>
-    <w:lsdException w:name="Colorful Grid Accent 1" w:uiPriority="73"/>
-    <w:lsdException w:name="Light Shading Accent 2" w:uiPriority="60"/>
-    <w:lsdException w:name="Light List Accent 2" w:uiPriority="61"/>
-    <w:lsdException w:name="Light Grid Accent 2" w:uiPriority="62"/>
-    <w:lsdException w:name="Medium Shading 1 Accent 2" w:uiPriority="63"/>
-    <w:lsdException w:name="Medium Shading 2 Accent 2" w:uiPriority="64"/>
-    <w:lsdException w:name="Medium List 1 Accent 2" w:uiPriority="65"/>
-    <w:lsdException w:name="Medium List 2 Accent 2" w:uiPriority="66"/>
-    <w:lsdException w:name="Medium Grid 1 Accent 2" w:uiPriority="67"/>
-    <w:lsdException w:name="Medium Grid 2 Accent 2" w:uiPriority="68"/>
-    <w:lsdException w:name="Medium Grid 3 Accent 2" w:uiPriority="69"/>
-    <w:lsdException w:name="Dark List Accent 2" w:uiPriority="70"/>
-    <w:lsdException w:name="Colorful Shading Accent 2" w:uiPriority="71"/>
-    <w:lsdException w:name="Colorful List Accent 2" w:uiPriority="72"/>
-    <w:lsdException w:name="Colorful Grid Accent 2" w:uiPriority="73"/>
-    <w:lsdException w:name="Light Shading Accent 3" w:uiPriority="60"/>
-    <w:lsdException w:name="Light List Accent 3" w:uiPriority="61"/>
-    <w:lsdException w:name="Light Grid Accent 3" w:uiPriority="62"/>
-    <w:lsdException w:name="Medium Shading 1 Accent 3" w:uiPriority="63"/>
-    <w:lsdException w:name="Medium Shading 2 Accent 3" w:uiPriority="64"/>
-    <w:lsdException w:name="Medium List 1 Accent 3" w:uiPriority="65"/>
-    <w:lsdException w:name="Medium List 2 Accent 3" w:uiPriority="66"/>
-    <w:lsdException w:name="Medium Grid 1 Accent 3" w:uiPriority="67"/>
-    <w:lsdException w:name="Medium Grid 2 Accent 3" w:uiPriority="68"/>
-    <w:lsdException w:name="Medium Grid 3 Accent 3" w:uiPriority="69"/>
-    <w:lsdException w:name="Dark List Accent 3" w:uiPriority="70"/>
-    <w:lsdException w:name="Colorful Shading Accent 3" w:uiPriority="71"/>
-    <w:lsdException w:name="Colorful List Accent 3" w:uiPriority="72"/>
-    <w:lsdException w:name="Colorful Grid Accent 3" w:uiPriority="73"/>
-    <w:lsdException w:name="Light Shading Accent 4" w:uiPriority="60"/>
-    <w:lsdException w:name="Light List Accent 4" w:uiPriority="61"/>
-    <w:lsdException w:name="Light Grid Accent 4" w:uiPriority="62"/>
-    <w:lsdException w:name="Medium Shading 1 Accent 4" w:uiPriority="63"/>
-    <w:lsdException w:name="Medium Shading 2 Accent 4" w:uiPriority="64"/>
-    <w:lsdException w:name="Medium List 1 Accent 4" w:uiPriority="65"/>
-    <w:lsdException w:name="Medium List 2 Accent 4" w:uiPriority="66"/>
-    <w:lsdException w:name="Medium Grid 1 Accent 4" w:uiPriority="67"/>
-    <w:lsdException w:name="Medium Grid 2 Accent 4" w:uiPriority="68"/>
-    <w:lsdException w:name="Medium Grid 3 Accent 4" w:uiPriority="69"/>
-    <w:lsdException w:name="Dark List Accent 4" w:uiPriority="70"/>
-    <w:lsdException w:name="Colorful Shading Accent 4" w:uiPriority="71"/>
-    <w:lsdException w:name="Colorful List Accent 4" w:uiPriority="72"/>
-    <w:lsdException w:name="Colorful Grid Accent 4" w:uiPriority="73"/>
-    <w:lsdException w:name="Light Shading Accent 5" w:uiPriority="60"/>
-    <w:lsdException w:name="Light List Accent 5" w:uiPriority="61"/>
-    <w:lsdException w:name="Light Grid Accent 5" w:uiPriority="62"/>
-    <w:lsdException w:name="Medium Shading 1 Accent 5" w:uiPriority="63"/>
-    <w:lsdException w:name="Medium Shading 2 Accent 5" w:uiPriority="64"/>
-    <w:lsdException w:name="Medium List 1 Accent 5" w:uiPriority="65"/>
-    <w:lsdException w:name="Medium List 2 Accent 5" w:uiPriority="66"/>
-    <w:lsdException w:name="Medium Grid 1 Accent 5" w:uiPriority="67"/>
-    <w:lsdException w:name="Medium Grid 2 Accent 5" w:uiPriority="68"/>
-    <w:lsdException w:name="Medium Grid 3 Accent 5" w:uiPriority="69"/>
-    <w:lsdException w:name="Dark List Accent 5" w:uiPriority="70"/>
-    <w:lsdException w:name="Colorful Shading Accent 5" w:uiPriority="71"/>
-    <w:lsdException w:name="Colorful List Accent 5" w:uiPriority="72"/>
-    <w:lsdException w:name="Colorful Grid Accent 5" w:uiPriority="73"/>
-    <w:lsdException w:name="Light Shading Accent 6" w:uiPriority="60"/>
-    <w:lsdException w:name="Light List Accent 6" w:uiPriority="61"/>
-    <w:lsdException w:name="Light Grid Accent 6" w:uiPriority="62"/>
-    <w:lsdException w:name="Medium Shading 1 Accent 6" w:uiPriority="63"/>
-    <w:lsdException w:name="Medium Shading 2 Accent 6" w:uiPriority="64"/>
-    <w:lsdException w:name="Medium List 1 Accent 6" w:uiPriority="65"/>
-    <w:lsdException w:name="Medium List 2 Accent 6" w:uiPriority="66"/>
-    <w:lsdException w:name="Medium Grid 1 Accent 6" w:uiPriority="67"/>
-    <w:lsdException w:name="Medium Grid 2 Accent 6" w:uiPriority="68"/>
-    <w:lsdException w:name="Medium Grid 3 Accent 6" w:uiPriority="69"/>
-    <w:lsdException w:name="Dark List Accent 6" w:uiPriority="70"/>
-    <w:lsdException w:name="Colorful Shading Accent 6" w:uiPriority="71"/>
-    <w:lsdException w:name="Colorful List Accent 6" w:uiPriority="72"/>
-    <w:lsdException w:name="Colorful Grid Accent 6" w:uiPriority="73"/>
-    <w:lsdException w:name="Subtle Emphasis" w:uiPriority="19" w:qFormat="1"/>
-    <w:lsdException w:name="Intense Emphasis" w:uiPriority="21" w:qFormat="1"/>
-    <w:lsdException w:name="Subtle Reference" w:uiPriority="31" w:qFormat="1"/>
-    <w:lsdException w:name="Intense Reference" w:uiPriority="32" w:qFormat="1"/>
-    <w:lsdException w:name="Book Title" w:uiPriority="33" w:qFormat="1"/>
-    <w:lsdException w:name="Bibliography" w:semiHidden="1" w:uiPriority="37" w:unhideWhenUsed="1"/>
-    <w:lsdException w:name="TOC Heading" w:semiHidden="1" w:uiPriority="39" w:unhideWhenUsed="1" w:qFormat="1"/>
-    <w:lsdException w:name="Plain Table 1" w:uiPriority="41"/>
-    <w:lsdException w:name="Plain Table 2" w:uiPriority="42"/>
-    <w:lsdException w:name="Plain Table 3" w:uiPriority="43"/>
-    <w:lsdException w:name="Plain Table 4" w:uiPriority="44"/>
-    <w:lsdException w:name="Plain Table 5" w:uiPriority="45"/>
-    <w:lsdException w:name="Grid Table Light" w:uiPriority="40"/>
-    <w:lsdException w:name="Grid Table 1 Light" w:uiPriority="46"/>
-    <w:lsdException w:name="Grid Table 2" w:uiPriority="47"/>
-    <w:lsdException w:name="Grid Table 3" w:uiPriority="48"/>
-    <w:lsdException w:name="Grid Table 4" w:uiPriority="49"/>
-    <w:lsdException w:name="Grid Table 5 Dark" w:uiPriority="50"/>
-    <w:lsdException w:name="Grid Table 6 Colorful" w:uiPriority="51"/>
-    <w:lsdException w:name="Grid Table 7 Colorful" w:uiPriority="52"/>
-    <w:lsdException w:name="Grid Table 1 Light Accent 1" w:uiPriority="46"/>
-    <w:lsdException w:name="Grid Table 2 Accent 1" w:uiPriority="47"/>
-    <w:lsdException w:name="Grid Table 3 Accent 1" w:uiPriority="48"/>
-    <w:lsdException w:name="Grid Table 4 Accent 1" w:uiPriority="49"/>
-    <w:lsdException w:name="Grid Table 5 Dark Accent 1" w:uiPriority="50"/>
-    <w:lsdException w:name="Grid Table 6 Colorful Accent 1" w:uiPriority="51"/>
-    <w:lsdException w:name="Grid Table 7 Colorful Accent 1" w:uiPriority="52"/>
-    <w:lsdException w:name="Grid Table 1 Light Accent 2" w:uiPriority="46"/>
-    <w:lsdException w:name="Grid Table 2 Accent 2" w:uiPriority="47"/>
-    <w:lsdException w:name="Grid Table 3 Accent 2" w:uiPriority="48"/>
-    <w:lsdException w:name="Grid Table 4 Accent 2" w:uiPriority="49"/>
-    <w:lsdException w:name="Grid Table 5 Dark Accent 2" w:uiPriority="50"/>
-    <w:lsdException w:name="Grid Table 6 Colorful Accent 2" w:uiPriority="51"/>
-    <w:lsdException w:name="Grid Table 7 Colorful Accent 2" w:uiPriority="52"/>
-    <w:lsdException w:name="Grid Table 1 Light Accent 3" w:uiPriority="46"/>
-    <w:lsdException w:name="Grid Table 2 Accent 3" w:uiPriority="47"/>
-    <w:lsdException w:name="Grid Table 3 Accent 3" w:uiPriority="48"/>
-    <w:lsdException w:name="Grid Table 4 Accent 3" w:uiPriority="49"/>
-    <w:lsdException w:name="Grid Table 5 Dark Accent 3" w:uiPriority="50"/>
-    <w:lsdException w:name="Grid Table 6 Colorful Accent 3" w:uiPriority="51"/>
-    <w:lsdException w:name="Grid Table 7 Colorful Accent 3" w:uiPriority="52"/>
-    <w:lsdException w:name="Grid Table 1 Light Accent 4" w:uiPriority="46"/>
-    <w:lsdException w:name="Grid Table 2 Accent 4" w:uiPriority="47"/>
-    <w:lsdException w:name="Grid Table 3 Accent 4" w:uiPriority="48"/>
-    <w:lsdException w:name="Grid Table 4 Accent 4" w:uiPriority="49"/>
-    <w:lsdException w:name="Grid Table 5 Dark Accent 4" w:uiPriority="50"/>
-    <w:lsdException w:name="Grid Table 6 Colorful Accent 4" w:uiPriority="51"/>
-    <w:lsdException w:name="Grid Table 7 Colorful Accent 4" w:uiPriority="52"/>
-    <w:lsdException w:name="Grid Table 1 Light Accent 5" w:uiPriority="46"/>
-    <w:lsdException w:name="Grid Table 2 Accent 5" w:uiPriority="47"/>
-    <w:lsdException w:name="Grid Table 3 Accent 5" w:uiPriority="48"/>
-    <w:lsdException w:name="Grid Table 4 Accent 5" w:uiPriority="49"/>
-    <w:lsdException w:name="Grid Table 5 Dark Accent 5" w:uiPriority="50"/>
-    <w:lsdException w:name="Grid Table 6 Colorful Accent 5" w:uiPriority="51"/>
-    <w:lsdException w:name="Grid Table 7 Colorful Accent 5" w:uiPriority="52"/>
-    <w:lsdException w:name="Grid Table 1 Light Accent 6" w:uiPriority="46"/>
-    <w:lsdException w:name="Grid Table 2 Accent 6" w:uiPriority="47"/>
-    <w:lsdException w:name="Grid Table 3 Accent 6" w:uiPriority="48"/>
-    <w:lsdException w:name="Grid Table 4 Accent 6" w:uiPriority="49"/>
-    <w:lsdException w:name="Grid Table 5 Dark Accent 6" w:uiPriority="50"/>
-    <w:lsdException w:name="Grid Table 6 Colorful Accent 6" w:uiPriority="51"/>
-    <w:lsdException w:name="Grid Table 7 Colorful Accent 6" w:uiPriority="52"/>
-    <w:lsdException w:name="List Table 1 Light" w:uiPriority="46"/>
-    <w:lsdException w:name="List Table 2" w:uiPriority="47"/>
-    <w:lsdException w:name="List Table 3" w:uiPriority="48"/>
-    <w:lsdException w:name="List Table 4" w:uiPriority="49"/>
-    <w:lsdException w:name="List Table 5 Dark" w:uiPriority="50"/>
-    <w:lsdException w:name="List Table 6 Colorful" w:uiPriority="51"/>
-    <w:lsdException w:name="List Table 7 Colorful" w:uiPriority="52"/>
-    <w:lsdException w:name="List Table 1 Light Accent 1" w:uiPriority="46"/>
-    <w:lsdException w:name="List Table 2 Accent 1" w:uiPriority="47"/>
-    <w:lsdException w:name="List Table 3 Accent 1" w:uiPriority="48"/>
-    <w:lsdException w:name="List Table 4 Accent 1" w:uiPriority="49"/>
-    <w:lsdException w:name="List Table 5 Dark Accent 1" w:uiPriority="50"/>
-    <w:lsdException w:name="List Table 6 Colorful Accent 1" w:uiPriority="51"/>
-    <w:lsdException w:name="List Table 7 Colorful Accent 1" w:uiPriority="52"/>
-    <w:lsdException w:name="List Table 1 Light Accent 2" w:uiPriority="46"/>
-    <w:lsdException w:name="List Table 2 Accent 2" w:uiPriority="47"/>
-    <w:lsdException w:name="List Table 3 Accent 2" w:uiPriority="48"/>
-    <w:lsdException w:name="List Table 4 Accent 2" w:uiPriority="49"/>
-    <w:lsdException w:name="List Table 5 Dark Accent 2" w:uiPriority="50"/>
-    <w:lsdException w:name="List Table 6 Colorful Accent 2" w:uiPriority="51"/>
-    <w:lsdException w:name="List Table 7 Colorful Accent 2" w:uiPriority="52"/>
-    <w:lsdException w:name="List Table 1 Light Accent 3" w:uiPriority="46"/>
-    <w:lsdException w:name="List Table 2 Accent 3" w:uiPriority="47"/>
-    <w:lsdException w:name="List Table 3 Accent 3" w:uiPriority="48"/>
-    <w:lsdException w:name="List Table 4 Accent 3" w:uiPriority="49"/>
-    <w:lsdException w:name="List Table 5 Dark Accent 3" w:uiPriority="50"/>
-    <w:lsdException w:name="List Table 6 Colorful Accent 3" w:uiPriority="51"/>
-    <w:lsdException w:name="List Table 7 Colorful Accent 3" w:uiPriority="52"/>
-    <w:lsdException w:name="List Table 1 Light Accent 4" w:uiPriority="46"/>
-    <w:lsdException w:name="List Table 2 Accent 4" w:uiPriority="47"/>
-    <w:lsdException w:name="List Table 3 Accent 4" w:uiPriority="48"/>
-    <w:lsdException w:name="List Table 4 Accent 4" w:uiPriority="49"/>
-    <w:lsdException w:name="List Table 5 Dark Accent 4" w:uiPriority="50"/>
-    <w:lsdException w:name="List Table 6 Colorful Accent 4" w:uiPriority="51"/>
-    <w:lsdException w:name="List Table 7 Colorful Accent 4" w:uiPriority="52"/>
-    <w:lsdException w:name="List Table 1 Light Accent 5" w:uiPriority="46"/>
-    <w:lsdException w:name="List Table 2 Accent 5" w:uiPriority="47"/>
-    <w:lsdException w:name="List Table 3 Accent 5" w:uiPriority="48"/>
-    <w:lsdException w:name="List Table 4 Accent 5" w:uiPriority="49"/>
-    <w:lsdException w:name="List Table 5 Dark Accent 5" w:uiPriority="50"/>
-    <w:lsdException w:name="List Table 6 Colorful Accent 5" w:uiPriority="51"/>
-    <w:lsdException w:name="List Table 7 Colorful Accent 5" w:uiPriority="52"/>
-    <w:lsdException w:name="List Table 1 Light Accent 6" w:uiPriority="46"/>
-    <w:lsdException w:name="List Table 2 Accent 6" w:uiPriority="47"/>
-    <w:lsdException w:name="List Table 3 Accent 6" w:uiPriority="48"/>
-    <w:lsdException w:name="List Table 4 Accent 6" w:uiPriority="49"/>
-    <w:lsdException w:name="List Table 5 Dark Accent 6" w:uiPriority="50"/>
-    <w:lsdException w:name="List Table 6 Colorful Accent 6" w:uiPriority="51"/>
-    <w:lsdException w:name="List Table 7 Colorful Accent 6" w:uiPriority="52"/>
-    <w:lsdException w:name="Mention" w:semiHidden="1" w:unhideWhenUsed="1"/>
-    <w:lsdException w:name="Smart Hyperlink" w:semiHidden="1" w:unhideWhenUsed="1"/>
-    <w:lsdException w:name="Hashtag" w:semiHidden="1" w:unhideWhenUsed="1"/>
-    <w:lsdException w:name="Unresolved Mention" w:semiHidden="1" w:unhideWhenUsed="1"/>
-    <w:lsdException w:name="Smart Link" w:semiHidden="1" w:unhideWhenUsed="1"/>
+  <w:latentStyles w:count="260" w:defQFormat="0" w:defUnhideWhenUsed="1" w:defSemiHidden="1" w:defUIPriority="99" w:defLockedState="0">
+    <w:lsdException w:qFormat="1" w:unhideWhenUsed="0" w:uiPriority="0" w:semiHidden="0" w:name="Normal"/>
+    <w:lsdException w:qFormat="1" w:unhideWhenUsed="0" w:uiPriority="9" w:semiHidden="0" w:name="heading 1"/>
+    <w:lsdException w:qFormat="1" w:uiPriority="9" w:name="heading 2"/>
+    <w:lsdException w:qFormat="1" w:uiPriority="9" w:name="heading 3"/>
+    <w:lsdException w:qFormat="1" w:uiPriority="9" w:name="heading 4"/>
+    <w:lsdException w:qFormat="1" w:uiPriority="9" w:name="heading 5"/>
+    <w:lsdException w:qFormat="1" w:uiPriority="9" w:name="heading 6"/>
+    <w:lsdException w:qFormat="1" w:uiPriority="9" w:name="heading 7"/>
+    <w:lsdException w:qFormat="1" w:uiPriority="9" w:name="heading 8"/>
+    <w:lsdException w:qFormat="1" w:uiPriority="9" w:name="heading 9"/>
+    <w:lsdException w:uiPriority="99" w:name="index 1"/>
+    <w:lsdException w:uiPriority="99" w:name="index 2"/>
+    <w:lsdException w:uiPriority="99" w:name="index 3"/>
+    <w:lsdException w:uiPriority="99" w:name="index 4"/>
+    <w:lsdException w:uiPriority="99" w:name="index 5"/>
+    <w:lsdException w:uiPriority="99" w:name="index 6"/>
+    <w:lsdException w:uiPriority="99" w:name="index 7"/>
+    <w:lsdException w:uiPriority="99" w:name="index 8"/>
+    <w:lsdException w:uiPriority="99" w:name="index 9"/>
+    <w:lsdException w:uiPriority="39" w:name="toc 1"/>
+    <w:lsdException w:uiPriority="39" w:name="toc 2"/>
+    <w:lsdException w:uiPriority="39" w:name="toc 3"/>
+    <w:lsdException w:uiPriority="39" w:name="toc 4"/>
+    <w:lsdException w:uiPriority="39" w:name="toc 5"/>
+    <w:lsdException w:uiPriority="39" w:name="toc 6"/>
+    <w:lsdException w:uiPriority="39" w:name="toc 7"/>
+    <w:lsdException w:uiPriority="39" w:name="toc 8"/>
+    <w:lsdException w:uiPriority="39" w:name="toc 9"/>
+    <w:lsdException w:uiPriority="99" w:name="Normal Indent"/>
+    <w:lsdException w:uiPriority="99" w:name="footnote text"/>
+    <w:lsdException w:uiPriority="99" w:name="annotation text"/>
+    <w:lsdException w:uiPriority="99" w:semiHidden="0" w:name="header"/>
+    <w:lsdException w:uiPriority="99" w:semiHidden="0" w:name="footer"/>
+    <w:lsdException w:uiPriority="99" w:name="index heading"/>
+    <w:lsdException w:qFormat="1" w:uiPriority="35" w:name="caption"/>
+    <w:lsdException w:uiPriority="99" w:name="table of figures"/>
+    <w:lsdException w:uiPriority="99" w:name="envelope address"/>
+    <w:lsdException w:uiPriority="99" w:name="envelope return"/>
+    <w:lsdException w:uiPriority="99" w:name="footnote reference"/>
+    <w:lsdException w:uiPriority="99" w:name="annotation reference"/>
+    <w:lsdException w:uiPriority="99" w:name="line number"/>
+    <w:lsdException w:uiPriority="99" w:name="page number"/>
+    <w:lsdException w:uiPriority="99" w:name="endnote reference"/>
+    <w:lsdException w:uiPriority="99" w:name="endnote text"/>
+    <w:lsdException w:uiPriority="99" w:name="table of authorities"/>
+    <w:lsdException w:uiPriority="99" w:name="macro"/>
+    <w:lsdException w:uiPriority="99" w:name="toa heading"/>
+    <w:lsdException w:uiPriority="99" w:name="List"/>
+    <w:lsdException w:uiPriority="99" w:name="List Bullet"/>
+    <w:lsdException w:uiPriority="99" w:name="List Number"/>
+    <w:lsdException w:uiPriority="99" w:name="List 2"/>
+    <w:lsdException w:uiPriority="99" w:name="List 3"/>
+    <w:lsdException w:uiPriority="99" w:name="List 4"/>
+    <w:lsdException w:uiPriority="99" w:name="List 5"/>
+    <w:lsdException w:uiPriority="99" w:name="List Bullet 2"/>
+    <w:lsdException w:uiPriority="99" w:name="List Bullet 3"/>
+    <w:lsdException w:uiPriority="99" w:name="List Bullet 4"/>
+    <w:lsdException w:uiPriority="99" w:name="List Bullet 5"/>
+    <w:lsdException w:uiPriority="99" w:name="List Number 2"/>
+    <w:lsdException w:uiPriority="99" w:name="List Number 3"/>
+    <w:lsdException w:uiPriority="99" w:name="List Number 4"/>
+    <w:lsdException w:uiPriority="99" w:name="List Number 5"/>
+    <w:lsdException w:qFormat="1" w:unhideWhenUsed="0" w:uiPriority="10" w:semiHidden="0" w:name="Title"/>
+    <w:lsdException w:uiPriority="99" w:name="Closing"/>
+    <w:lsdException w:uiPriority="99" w:name="Signature"/>
+    <w:lsdException w:uiPriority="1" w:name="Default Paragraph Font"/>
+    <w:lsdException w:uiPriority="99" w:name="Body Text"/>
+    <w:lsdException w:uiPriority="99" w:name="Body Text Indent"/>
+    <w:lsdException w:uiPriority="99" w:name="List Continue"/>
+    <w:lsdException w:uiPriority="99" w:name="List Continue 2"/>
+    <w:lsdException w:uiPriority="99" w:name="List Continue 3"/>
+    <w:lsdException w:uiPriority="99" w:name="List Continue 4"/>
+    <w:lsdException w:uiPriority="99" w:name="List Continue 5"/>
+    <w:lsdException w:uiPriority="99" w:name="Message Header"/>
+    <w:lsdException w:qFormat="1" w:unhideWhenUsed="0" w:uiPriority="11" w:semiHidden="0" w:name="Subtitle"/>
+    <w:lsdException w:uiPriority="99" w:name="Salutation"/>
+    <w:lsdException w:uiPriority="99" w:name="Date"/>
+    <w:lsdException w:uiPriority="99" w:name="Body Text First Indent"/>
+    <w:lsdException w:uiPriority="99" w:name="Body Text First Indent 2"/>
+    <w:lsdException w:uiPriority="99" w:name="Note Heading"/>
+    <w:lsdException w:uiPriority="99" w:name="Body Text 2"/>
+    <w:lsdException w:uiPriority="99" w:name="Body Text 3"/>
+    <w:lsdException w:uiPriority="99" w:name="Body Text Indent 2"/>
+    <w:lsdException w:uiPriority="99" w:name="Body Text Indent 3"/>
+    <w:lsdException w:uiPriority="99" w:name="Block Text"/>
+    <w:lsdException w:uiPriority="99" w:name="Hyperlink"/>
+    <w:lsdException w:uiPriority="99" w:name="FollowedHyperlink"/>
+    <w:lsdException w:qFormat="1" w:unhideWhenUsed="0" w:uiPriority="22" w:semiHidden="0" w:name="Strong"/>
+    <w:lsdException w:qFormat="1" w:unhideWhenUsed="0" w:uiPriority="20" w:semiHidden="0" w:name="Emphasis"/>
+    <w:lsdException w:uiPriority="99" w:name="Document Map"/>
+    <w:lsdException w:uiPriority="99" w:name="Plain Text"/>
+    <w:lsdException w:uiPriority="99" w:name="E-mail Signature"/>
+    <w:lsdException w:uiPriority="99" w:name="Normal (Web)"/>
+    <w:lsdException w:uiPriority="99" w:name="HTML Acronym"/>
+    <w:lsdException w:uiPriority="99" w:name="HTML Address"/>
+    <w:lsdException w:uiPriority="99" w:name="HTML Cite"/>
+    <w:lsdException w:uiPriority="99" w:name="HTML Code"/>
+    <w:lsdException w:uiPriority="99" w:name="HTML Definition"/>
+    <w:lsdException w:uiPriority="99" w:name="HTML Keyboard"/>
+    <w:lsdException w:uiPriority="99" w:name="HTML Preformatted"/>
+    <w:lsdException w:uiPriority="99" w:name="HTML Sample"/>
+    <w:lsdException w:uiPriority="99" w:name="HTML Typewriter"/>
+    <w:lsdException w:uiPriority="99" w:name="HTML Variable"/>
+    <w:lsdException w:uiPriority="99" w:name="Normal Table"/>
+    <w:lsdException w:uiPriority="99" w:name="annotation subject"/>
+    <w:lsdException w:uiPriority="99" w:name="Table Simple 1"/>
+    <w:lsdException w:uiPriority="99" w:name="Table Simple 2"/>
+    <w:lsdException w:uiPriority="99" w:name="Table Simple 3"/>
+    <w:lsdException w:uiPriority="99" w:name="Table Classic 1"/>
+    <w:lsdException w:uiPriority="99" w:name="Table Classic 2"/>
+    <w:lsdException w:uiPriority="99" w:name="Table Classic 3"/>
+    <w:lsdException w:uiPriority="99" w:name="Table Classic 4"/>
+    <w:lsdException w:uiPriority="99" w:name="Table Colorful 1"/>
+    <w:lsdException w:uiPriority="99" w:name="Table Colorful 2"/>
+    <w:lsdException w:uiPriority="99" w:name="Table Colorful 3"/>
+    <w:lsdException w:uiPriority="99" w:name="Table Columns 1"/>
+    <w:lsdException w:uiPriority="99" w:name="Table Columns 2"/>
+    <w:lsdException w:uiPriority="99" w:name="Table Columns 3"/>
+    <w:lsdException w:uiPriority="99" w:name="Table Columns 4"/>
+    <w:lsdException w:uiPriority="99" w:name="Table Columns 5"/>
+    <w:lsdException w:uiPriority="99" w:name="Table Grid 1"/>
+    <w:lsdException w:uiPriority="99" w:name="Table Grid 2"/>
+    <w:lsdException w:uiPriority="99" w:name="Table Grid 3"/>
+    <w:lsdException w:uiPriority="99" w:name="Table Grid 4"/>
+    <w:lsdException w:uiPriority="99" w:name="Table Grid 5"/>
+    <w:lsdException w:uiPriority="99" w:name="Table Grid 6"/>
+    <w:lsdException w:uiPriority="99" w:name="Table Grid 7"/>
+    <w:lsdException w:uiPriority="99" w:name="Table Grid 8"/>
+    <w:lsdException w:uiPriority="99" w:name="Table List 1"/>
+    <w:lsdException w:uiPriority="99" w:name="Table List 2"/>
+    <w:lsdException w:uiPriority="99" w:name="Table List 3"/>
+    <w:lsdException w:uiPriority="99" w:name="Table List 4"/>
+    <w:lsdException w:uiPriority="99" w:name="Table List 5"/>
+    <w:lsdException w:uiPriority="99" w:name="Table List 6"/>
+    <w:lsdException w:uiPriority="99" w:name="Table List 7"/>
+    <w:lsdException w:uiPriority="99" w:name="Table List 8"/>
+    <w:lsdException w:uiPriority="99" w:name="Table 3D effects 1"/>
+    <w:lsdException w:uiPriority="99" w:name="Table 3D effects 2"/>
+    <w:lsdException w:uiPriority="99" w:name="Table 3D effects 3"/>
+    <w:lsdException w:uiPriority="99" w:name="Table Contemporary"/>
+    <w:lsdException w:uiPriority="99" w:name="Table Elegant"/>
+    <w:lsdException w:uiPriority="99" w:name="Table Professional"/>
+    <w:lsdException w:uiPriority="99" w:name="Table Subtle 1"/>
+    <w:lsdException w:uiPriority="99" w:name="Table Subtle 2"/>
+    <w:lsdException w:uiPriority="99" w:name="Table Web 1"/>
+    <w:lsdException w:uiPriority="99" w:name="Table Web 2"/>
+    <w:lsdException w:uiPriority="99" w:name="Table Web 3"/>
+    <w:lsdException w:uiPriority="99" w:name="Balloon Text"/>
+    <w:lsdException w:unhideWhenUsed="0" w:uiPriority="39" w:semiHidden="0" w:name="Table Grid"/>
+    <w:lsdException w:uiPriority="99" w:name="Table Theme"/>
+    <w:lsdException w:unhideWhenUsed="0" w:uiPriority="60" w:semiHidden="0" w:name="Light Shading"/>
+    <w:lsdException w:unhideWhenUsed="0" w:uiPriority="61" w:semiHidden="0" w:name="Light List"/>
+    <w:lsdException w:unhideWhenUsed="0" w:uiPriority="62" w:semiHidden="0" w:name="Light Grid"/>
+    <w:lsdException w:unhideWhenUsed="0" w:uiPriority="63" w:semiHidden="0" w:name="Medium Shading 1"/>
+    <w:lsdException w:unhideWhenUsed="0" w:uiPriority="64" w:semiHidden="0" w:name="Medium Shading 2"/>
+    <w:lsdException w:unhideWhenUsed="0" w:uiPriority="65" w:semiHidden="0" w:name="Medium List 1"/>
+    <w:lsdException w:unhideWhenUsed="0" w:uiPriority="66" w:semiHidden="0" w:name="Medium List 2"/>
+    <w:lsdException w:unhideWhenUsed="0" w:uiPriority="67" w:semiHidden="0" w:name="Medium Grid 1"/>
+    <w:lsdException w:unhideWhenUsed="0" w:uiPriority="68" w:semiHidden="0" w:name="Medium Grid 2"/>
+    <w:lsdException w:unhideWhenUsed="0" w:uiPriority="69" w:semiHidden="0" w:name="Medium Grid 3"/>
+    <w:lsdException w:unhideWhenUsed="0" w:uiPriority="70" w:semiHidden="0" w:name="Dark List"/>
+    <w:lsdException w:unhideWhenUsed="0" w:uiPriority="71" w:semiHidden="0" w:name="Colorful Shading"/>
+    <w:lsdException w:unhideWhenUsed="0" w:uiPriority="72" w:semiHidden="0" w:name="Colorful List"/>
+    <w:lsdException w:unhideWhenUsed="0" w:uiPriority="73" w:semiHidden="0" w:name="Colorful Grid"/>
+    <w:lsdException w:unhideWhenUsed="0" w:uiPriority="60" w:semiHidden="0" w:name="Light Shading Accent 1"/>
+    <w:lsdException w:unhideWhenUsed="0" w:uiPriority="61" w:semiHidden="0" w:name="Light List Accent 1"/>
+    <w:lsdException w:unhideWhenUsed="0" w:uiPriority="62" w:semiHidden="0" w:name="Light Grid Accent 1"/>
+    <w:lsdException w:unhideWhenUsed="0" w:uiPriority="63" w:semiHidden="0" w:name="Medium Shading 1 Accent 1"/>
+    <w:lsdException w:unhideWhenUsed="0" w:uiPriority="64" w:semiHidden="0" w:name="Medium Shading 2 Accent 1"/>
+    <w:lsdException w:unhideWhenUsed="0" w:uiPriority="65" w:semiHidden="0" w:name="Medium List 1 Accent 1"/>
+    <w:lsdException w:qFormat="1" w:unhideWhenUsed="0" w:uiPriority="34" w:semiHidden="0" w:name="List Paragraph"/>
+    <w:lsdException w:qFormat="1" w:unhideWhenUsed="0" w:uiPriority="29" w:semiHidden="0" w:name="Quote"/>
+    <w:lsdException w:qFormat="1" w:unhideWhenUsed="0" w:uiPriority="30" w:semiHidden="0" w:name="Intense Quote"/>
+    <w:lsdException w:unhideWhenUsed="0" w:uiPriority="66" w:semiHidden="0" w:name="Medium List 2 Accent 1"/>
+    <w:lsdException w:unhideWhenUsed="0" w:uiPriority="67" w:semiHidden="0" w:name="Medium Grid 1 Accent 1"/>
+    <w:lsdException w:unhideWhenUsed="0" w:uiPriority="68" w:semiHidden="0" w:name="Medium Grid 2 Accent 1"/>
+    <w:lsdException w:unhideWhenUsed="0" w:uiPriority="69" w:semiHidden="0" w:name="Medium Grid 3 Accent 1"/>
+    <w:lsdException w:unhideWhenUsed="0" w:uiPriority="70" w:semiHidden="0" w:name="Dark List Accent 1"/>
+    <w:lsdException w:unhideWhenUsed="0" w:uiPriority="71" w:semiHidden="0" w:name="Colorful Shading Accent 1"/>
+    <w:lsdException w:unhideWhenUsed="0" w:uiPriority="72" w:semiHidden="0" w:name="Colorful List Accent 1"/>
+    <w:lsdException w:unhideWhenUsed="0" w:uiPriority="73" w:semiHidden="0" w:name="Colorful Grid Accent 1"/>
+    <w:lsdException w:unhideWhenUsed="0" w:uiPriority="60" w:semiHidden="0" w:name="Light Shading Accent 2"/>
+    <w:lsdException w:unhideWhenUsed="0" w:uiPriority="61" w:semiHidden="0" w:name="Light List Accent 2"/>
+    <w:lsdException w:unhideWhenUsed="0" w:uiPriority="62" w:semiHidden="0" w:name="Light Grid Accent 2"/>
+    <w:lsdException w:unhideWhenUsed="0" w:uiPriority="63" w:semiHidden="0" w:name="Medium Shading 1 Accent 2"/>
+    <w:lsdException w:unhideWhenUsed="0" w:uiPriority="64" w:semiHidden="0" w:name="Medium Shading 2 Accent 2"/>
+    <w:lsdException w:unhideWhenUsed="0" w:uiPriority="65" w:semiHidden="0" w:name="Medium List 1 Accent 2"/>
+    <w:lsdException w:unhideWhenUsed="0" w:uiPriority="66" w:semiHidden="0" w:name="Medium List 2 Accent 2"/>
+    <w:lsdException w:unhideWhenUsed="0" w:uiPriority="67" w:semiHidden="0" w:name="Medium Grid 1 Accent 2"/>
+    <w:lsdException w:unhideWhenUsed="0" w:uiPriority="68" w:semiHidden="0" w:name="Medium Grid 2 Accent 2"/>
+    <w:lsdException w:unhideWhenUsed="0" w:uiPriority="69" w:semiHidden="0" w:name="Medium Grid 3 Accent 2"/>
+    <w:lsdException w:unhideWhenUsed="0" w:uiPriority="70" w:semiHidden="0" w:name="Dark List Accent 2"/>
+    <w:lsdException w:unhideWhenUsed="0" w:uiPriority="71" w:semiHidden="0" w:name="Colorful Shading Accent 2"/>
+    <w:lsdException w:unhideWhenUsed="0" w:uiPriority="72" w:semiHidden="0" w:name="Colorful List Accent 2"/>
+    <w:lsdException w:unhideWhenUsed="0" w:uiPriority="73" w:semiHidden="0" w:name="Colorful Grid Accent 2"/>
+    <w:lsdException w:unhideWhenUsed="0" w:uiPriority="60" w:semiHidden="0" w:name="Light Shading Accent 3"/>
+    <w:lsdException w:unhideWhenUsed="0" w:uiPriority="61" w:semiHidden="0" w:name="Light List Accent 3"/>
+    <w:lsdException w:unhideWhenUsed="0" w:uiPriority="62" w:semiHidden="0" w:name="Light Grid Accent 3"/>
+    <w:lsdException w:unhideWhenUsed="0" w:uiPriority="63" w:semiHidden="0" w:name="Medium Shading 1 Accent 3"/>
+    <w:lsdException w:unhideWhenUsed="0" w:uiPriority="64" w:semiHidden="0" w:name="Medium Shading 2 Accent 3"/>
+    <w:lsdException w:unhideWhenUsed="0" w:uiPriority="65" w:semiHidden="0" w:name="Medium List 1 Accent 3"/>
+    <w:lsdException w:unhideWhenUsed="0" w:uiPriority="66" w:semiHidden="0" w:name="Medium List 2 Accent 3"/>
+    <w:lsdException w:unhideWhenUsed="0" w:uiPriority="67" w:semiHidden="0" w:name="Medium Grid 1 Accent 3"/>
+    <w:lsdException w:unhideWhenUsed="0" w:uiPriority="68" w:semiHidden="0" w:name="Medium Grid 2 Accent 3"/>
+    <w:lsdException w:unhideWhenUsed="0" w:uiPriority="69" w:semiHidden="0" w:name="Medium Grid 3 Accent 3"/>
+    <w:lsdException w:unhideWhenUsed="0" w:uiPriority="70" w:semiHidden="0" w:name="Dark List Accent 3"/>
+    <w:lsdException w:unhideWhenUsed="0" w:uiPriority="71" w:semiHidden="0" w:name="Colorful Shading Accent 3"/>
+    <w:lsdException w:unhideWhenUsed="0" w:uiPriority="72" w:semiHidden="0" w:name="Colorful List Accent 3"/>
+    <w:lsdException w:unhideWhenUsed="0" w:uiPriority="73" w:semiHidden="0" w:name="Colorful Grid Accent 3"/>
+    <w:lsdException w:unhideWhenUsed="0" w:uiPriority="60" w:semiHidden="0" w:name="Light Shading Accent 4"/>
+    <w:lsdException w:unhideWhenUsed="0" w:uiPriority="61" w:semiHidden="0" w:name="Light List Accent 4"/>
+    <w:lsdException w:unhideWhenUsed="0" w:uiPriority="62" w:semiHidden="0" w:name="Light Grid Accent 4"/>
+    <w:lsdException w:unhideWhenUsed="0" w:uiPriority="63" w:semiHidden="0" w:name="Medium Shading 1 Accent 4"/>
+    <w:lsdException w:unhideWhenUsed="0" w:uiPriority="64" w:semiHidden="0" w:name="Medium Shading 2 Accent 4"/>
+    <w:lsdException w:unhideWhenUsed="0" w:uiPriority="65" w:semiHidden="0" w:name="Medium List 1 Accent 4"/>
+    <w:lsdException w:unhideWhenUsed="0" w:uiPriority="66" w:semiHidden="0" w:name="Medium List 2 Accent 4"/>
+    <w:lsdException w:unhideWhenUsed="0" w:uiPriority="67" w:semiHidden="0" w:name="Medium Grid 1 Accent 4"/>
+    <w:lsdException w:unhideWhenUsed="0" w:uiPriority="68" w:semiHidden="0" w:name="Medium Grid 2 Accent 4"/>
+    <w:lsdException w:unhideWhenUsed="0" w:uiPriority="69" w:semiHidden="0" w:name="Medium Grid 3 Accent 4"/>
+    <w:lsdException w:unhideWhenUsed="0" w:uiPriority="70" w:semiHidden="0" w:name="Dark List Accent 4"/>
+    <w:lsdException w:unhideWhenUsed="0" w:uiPriority="71" w:semiHidden="0" w:name="Colorful Shading Accent 4"/>
+    <w:lsdException w:unhideWhenUsed="0" w:uiPriority="72" w:semiHidden="0" w:name="Colorful List Accent 4"/>
+    <w:lsdException w:unhideWhenUsed="0" w:uiPriority="73" w:semiHidden="0" w:name="Colorful Grid Accent 4"/>
+    <w:lsdException w:unhideWhenUsed="0" w:uiPriority="60" w:semiHidden="0" w:name="Light Shading Accent 5"/>
+    <w:lsdException w:unhideWhenUsed="0" w:uiPriority="61" w:semiHidden="0" w:name="Light List Accent 5"/>
+    <w:lsdException w:unhideWhenUsed="0" w:uiPriority="62" w:semiHidden="0" w:name="Light Grid Accent 5"/>
+    <w:lsdException w:unhideWhenUsed="0" w:uiPriority="63" w:semiHidden="0" w:name="Medium Shading 1 Accent 5"/>
+    <w:lsdException w:unhideWhenUsed="0" w:uiPriority="64" w:semiHidden="0" w:name="Medium Shading 2 Accent 5"/>
+    <w:lsdException w:unhideWhenUsed="0" w:uiPriority="65" w:semiHidden="0" w:name="Medium List 1 Accent 5"/>
+    <w:lsdException w:unhideWhenUsed="0" w:uiPriority="66" w:semiHidden="0" w:name="Medium List 2 Accent 5"/>
+    <w:lsdException w:unhideWhenUsed="0" w:uiPriority="67" w:semiHidden="0" w:name="Medium Grid 1 Accent 5"/>
+    <w:lsdException w:unhideWhenUsed="0" w:uiPriority="68" w:semiHidden="0" w:name="Medium Grid 2 Accent 5"/>
+    <w:lsdException w:unhideWhenUsed="0" w:uiPriority="69" w:semiHidden="0" w:name="Medium Grid 3 Accent 5"/>
+    <w:lsdException w:unhideWhenUsed="0" w:uiPriority="70" w:semiHidden="0" w:name="Dark List Accent 5"/>
+    <w:lsdException w:unhideWhenUsed="0" w:uiPriority="71" w:semiHidden="0" w:name="Colorful Shading Accent 5"/>
+    <w:lsdException w:unhideWhenUsed="0" w:uiPriority="72" w:semiHidden="0" w:name="Colorful List Accent 5"/>
+    <w:lsdException w:unhideWhenUsed="0" w:uiPriority="73" w:semiHidden="0" w:name="Colorful Grid Accent 5"/>
+    <w:lsdException w:unhideWhenUsed="0" w:uiPriority="60" w:semiHidden="0" w:name="Light Shading Accent 6"/>
+    <w:lsdException w:unhideWhenUsed="0" w:uiPriority="61" w:semiHidden="0" w:name="Light List Accent 6"/>
+    <w:lsdException w:unhideWhenUsed="0" w:uiPriority="62" w:semiHidden="0" w:name="Light Grid Accent 6"/>
+    <w:lsdException w:unhideWhenUsed="0" w:uiPriority="63" w:semiHidden="0" w:name="Medium Shading 1 Accent 6"/>
+    <w:lsdException w:unhideWhenUsed="0" w:uiPriority="64" w:semiHidden="0" w:name="Medium Shading 2 Accent 6"/>
+    <w:lsdException w:unhideWhenUsed="0" w:uiPriority="65" w:semiHidden="0" w:name="Medium List 1 Accent 6"/>
+    <w:lsdException w:unhideWhenUsed="0" w:uiPriority="66" w:semiHidden="0" w:name="Medium List 2 Accent 6"/>
+    <w:lsdException w:unhideWhenUsed="0" w:uiPriority="67" w:semiHidden="0" w:name="Medium Grid 1 Accent 6"/>
+    <w:lsdException w:unhideWhenUsed="0" w:uiPriority="68" w:semiHidden="0" w:name="Medium Grid 2 Accent 6"/>
+    <w:lsdException w:unhideWhenUsed="0" w:uiPriority="69" w:semiHidden="0" w:name="Medium Grid 3 Accent 6"/>
+    <w:lsdException w:unhideWhenUsed="0" w:uiPriority="70" w:semiHidden="0" w:name="Dark List Accent 6"/>
+    <w:lsdException w:unhideWhenUsed="0" w:uiPriority="71" w:semiHidden="0" w:name="Colorful Shading Accent 6"/>
+    <w:lsdException w:unhideWhenUsed="0" w:uiPriority="72" w:semiHidden="0" w:name="Colorful List Accent 6"/>
+    <w:lsdException w:unhideWhenUsed="0" w:uiPriority="73" w:semiHidden="0" w:name="Colorful Grid Accent 6"/>
   </w:latentStyles>
-  <w:style w:type="paragraph" w:default="1" w:styleId="Normal">
+  <w:style w:type="paragraph" w:default="1" w:styleId="1">
     <w:name w:val="Normal"/>
     <w:qFormat/>
+    <w:uiPriority w:val="0"/>
+    <w:pPr>
+      <w:spacing w:after="160" w:line="278" w:lineRule="auto"/>
+    </w:pPr>
+    <w:rPr>
+      <w:rFonts w:asciiTheme="minorHAnsi" w:hAnsiTheme="minorHAnsi" w:eastAsiaTheme="minorHAnsi" w:cstheme="minorBidi"/>
+      <w:kern w:val="2"/>
+      <w:sz w:val="24"/>
+      <w:szCs w:val="24"/>
+      <w:lang w:val="en-IN" w:eastAsia="en-US" w:bidi="ar-SA"/>
+      <w14:ligatures w14:val="standardContextual"/>
+    </w:rPr>
   </w:style>
-  <w:style w:type="paragraph" w:styleId="Heading1">
+  <w:style w:type="paragraph" w:styleId="2">
     <w:name w:val="heading 1"/>
-    <w:basedOn w:val="Normal"/>
-    <w:next w:val="Normal"/>
-    <w:link w:val="Heading1Char"/>
+    <w:basedOn w:val="1"/>
+    <w:next w:val="1"/>
+    <w:link w:val="17"/>
+    <w:qFormat/>
     <w:uiPriority w:val="9"/>
-    <w:qFormat/>
-    <w:rsid w:val="00A076D0"/>
     <w:pPr>
       <w:keepNext/>
       <w:keepLines/>
@@ -2470,22 +2674,21 @@
       <w:outlineLvl w:val="0"/>
     </w:pPr>
     <w:rPr>
-      <w:rFonts w:asciiTheme="majorHAnsi" w:eastAsiaTheme="majorEastAsia" w:hAnsiTheme="majorHAnsi" w:cstheme="majorBidi"/>
-      <w:color w:val="2F5496" w:themeColor="accent1" w:themeShade="BF"/>
+      <w:rFonts w:asciiTheme="majorHAnsi" w:hAnsiTheme="majorHAnsi" w:eastAsiaTheme="majorEastAsia" w:cstheme="majorBidi"/>
+      <w:color w:val="2F5597" w:themeColor="accent1" w:themeShade="BF"/>
       <w:sz w:val="40"/>
       <w:szCs w:val="40"/>
     </w:rPr>
   </w:style>
-  <w:style w:type="paragraph" w:styleId="Heading2">
+  <w:style w:type="paragraph" w:styleId="3">
     <w:name w:val="heading 2"/>
-    <w:basedOn w:val="Normal"/>
-    <w:next w:val="Normal"/>
-    <w:link w:val="Heading2Char"/>
-    <w:uiPriority w:val="9"/>
+    <w:basedOn w:val="1"/>
+    <w:next w:val="1"/>
+    <w:link w:val="18"/>
     <w:semiHidden/>
     <w:unhideWhenUsed/>
     <w:qFormat/>
-    <w:rsid w:val="00A076D0"/>
+    <w:uiPriority w:val="9"/>
     <w:pPr>
       <w:keepNext/>
       <w:keepLines/>
@@ -2493,22 +2696,21 @@
       <w:outlineLvl w:val="1"/>
     </w:pPr>
     <w:rPr>
-      <w:rFonts w:asciiTheme="majorHAnsi" w:eastAsiaTheme="majorEastAsia" w:hAnsiTheme="majorHAnsi" w:cstheme="majorBidi"/>
-      <w:color w:val="2F5496" w:themeColor="accent1" w:themeShade="BF"/>
+      <w:rFonts w:asciiTheme="majorHAnsi" w:hAnsiTheme="majorHAnsi" w:eastAsiaTheme="majorEastAsia" w:cstheme="majorBidi"/>
+      <w:color w:val="2F5597" w:themeColor="accent1" w:themeShade="BF"/>
       <w:sz w:val="32"/>
       <w:szCs w:val="32"/>
     </w:rPr>
   </w:style>
-  <w:style w:type="paragraph" w:styleId="Heading3">
+  <w:style w:type="paragraph" w:styleId="4">
     <w:name w:val="heading 3"/>
-    <w:basedOn w:val="Normal"/>
-    <w:next w:val="Normal"/>
-    <w:link w:val="Heading3Char"/>
-    <w:uiPriority w:val="9"/>
+    <w:basedOn w:val="1"/>
+    <w:next w:val="1"/>
+    <w:link w:val="19"/>
     <w:semiHidden/>
     <w:unhideWhenUsed/>
     <w:qFormat/>
-    <w:rsid w:val="00A076D0"/>
+    <w:uiPriority w:val="9"/>
     <w:pPr>
       <w:keepNext/>
       <w:keepLines/>
@@ -2517,21 +2719,20 @@
     </w:pPr>
     <w:rPr>
       <w:rFonts w:eastAsiaTheme="majorEastAsia" w:cstheme="majorBidi"/>
-      <w:color w:val="2F5496" w:themeColor="accent1" w:themeShade="BF"/>
+      <w:color w:val="2F5597" w:themeColor="accent1" w:themeShade="BF"/>
       <w:sz w:val="28"/>
       <w:szCs w:val="28"/>
     </w:rPr>
   </w:style>
-  <w:style w:type="paragraph" w:styleId="Heading4">
+  <w:style w:type="paragraph" w:styleId="5">
     <w:name w:val="heading 4"/>
-    <w:basedOn w:val="Normal"/>
-    <w:next w:val="Normal"/>
-    <w:link w:val="Heading4Char"/>
-    <w:uiPriority w:val="9"/>
+    <w:basedOn w:val="1"/>
+    <w:next w:val="1"/>
+    <w:link w:val="20"/>
     <w:semiHidden/>
     <w:unhideWhenUsed/>
     <w:qFormat/>
-    <w:rsid w:val="00A076D0"/>
+    <w:uiPriority w:val="9"/>
     <w:pPr>
       <w:keepNext/>
       <w:keepLines/>
@@ -2542,19 +2743,18 @@
       <w:rFonts w:eastAsiaTheme="majorEastAsia" w:cstheme="majorBidi"/>
       <w:i/>
       <w:iCs/>
-      <w:color w:val="2F5496" w:themeColor="accent1" w:themeShade="BF"/>
+      <w:color w:val="2F5597" w:themeColor="accent1" w:themeShade="BF"/>
     </w:rPr>
   </w:style>
-  <w:style w:type="paragraph" w:styleId="Heading5">
+  <w:style w:type="paragraph" w:styleId="6">
     <w:name w:val="heading 5"/>
-    <w:basedOn w:val="Normal"/>
-    <w:next w:val="Normal"/>
-    <w:link w:val="Heading5Char"/>
-    <w:uiPriority w:val="9"/>
+    <w:basedOn w:val="1"/>
+    <w:next w:val="1"/>
+    <w:link w:val="21"/>
     <w:semiHidden/>
     <w:unhideWhenUsed/>
     <w:qFormat/>
-    <w:rsid w:val="00A076D0"/>
+    <w:uiPriority w:val="9"/>
     <w:pPr>
       <w:keepNext/>
       <w:keepLines/>
@@ -2563,19 +2763,18 @@
     </w:pPr>
     <w:rPr>
       <w:rFonts w:eastAsiaTheme="majorEastAsia" w:cstheme="majorBidi"/>
-      <w:color w:val="2F5496" w:themeColor="accent1" w:themeShade="BF"/>
+      <w:color w:val="2F5597" w:themeColor="accent1" w:themeShade="BF"/>
     </w:rPr>
   </w:style>
-  <w:style w:type="paragraph" w:styleId="Heading6">
+  <w:style w:type="paragraph" w:styleId="7">
     <w:name w:val="heading 6"/>
-    <w:basedOn w:val="Normal"/>
-    <w:next w:val="Normal"/>
-    <w:link w:val="Heading6Char"/>
-    <w:uiPriority w:val="9"/>
+    <w:basedOn w:val="1"/>
+    <w:next w:val="1"/>
+    <w:link w:val="22"/>
     <w:semiHidden/>
     <w:unhideWhenUsed/>
     <w:qFormat/>
-    <w:rsid w:val="00A076D0"/>
+    <w:uiPriority w:val="9"/>
     <w:pPr>
       <w:keepNext/>
       <w:keepLines/>
@@ -2587,18 +2786,25 @@
       <w:i/>
       <w:iCs/>
       <w:color w:val="595959" w:themeColor="text1" w:themeTint="A6"/>
+      <w14:textFill>
+        <w14:solidFill>
+          <w14:schemeClr w14:val="tx1">
+            <w14:lumMod w14:val="65000"/>
+            <w14:lumOff w14:val="35000"/>
+          </w14:schemeClr>
+        </w14:solidFill>
+      </w14:textFill>
     </w:rPr>
   </w:style>
-  <w:style w:type="paragraph" w:styleId="Heading7">
+  <w:style w:type="paragraph" w:styleId="8">
     <w:name w:val="heading 7"/>
-    <w:basedOn w:val="Normal"/>
-    <w:next w:val="Normal"/>
-    <w:link w:val="Heading7Char"/>
-    <w:uiPriority w:val="9"/>
+    <w:basedOn w:val="1"/>
+    <w:next w:val="1"/>
+    <w:link w:val="23"/>
     <w:semiHidden/>
     <w:unhideWhenUsed/>
     <w:qFormat/>
-    <w:rsid w:val="00A076D0"/>
+    <w:uiPriority w:val="9"/>
     <w:pPr>
       <w:keepNext/>
       <w:keepLines/>
@@ -2608,18 +2814,25 @@
     <w:rPr>
       <w:rFonts w:eastAsiaTheme="majorEastAsia" w:cstheme="majorBidi"/>
       <w:color w:val="595959" w:themeColor="text1" w:themeTint="A6"/>
+      <w14:textFill>
+        <w14:solidFill>
+          <w14:schemeClr w14:val="tx1">
+            <w14:lumMod w14:val="65000"/>
+            <w14:lumOff w14:val="35000"/>
+          </w14:schemeClr>
+        </w14:solidFill>
+      </w14:textFill>
     </w:rPr>
   </w:style>
-  <w:style w:type="paragraph" w:styleId="Heading8">
+  <w:style w:type="paragraph" w:styleId="9">
     <w:name w:val="heading 8"/>
-    <w:basedOn w:val="Normal"/>
-    <w:next w:val="Normal"/>
-    <w:link w:val="Heading8Char"/>
-    <w:uiPriority w:val="9"/>
+    <w:basedOn w:val="1"/>
+    <w:next w:val="1"/>
+    <w:link w:val="24"/>
     <w:semiHidden/>
     <w:unhideWhenUsed/>
     <w:qFormat/>
-    <w:rsid w:val="00A076D0"/>
+    <w:uiPriority w:val="9"/>
     <w:pPr>
       <w:keepNext/>
       <w:keepLines/>
@@ -2630,19 +2843,26 @@
       <w:rFonts w:eastAsiaTheme="majorEastAsia" w:cstheme="majorBidi"/>
       <w:i/>
       <w:iCs/>
-      <w:color w:val="272727" w:themeColor="text1" w:themeTint="D8"/>
+      <w:color w:val="262626" w:themeColor="text1" w:themeTint="D9"/>
+      <w14:textFill>
+        <w14:solidFill>
+          <w14:schemeClr w14:val="tx1">
+            <w14:lumMod w14:val="85000"/>
+            <w14:lumOff w14:val="15000"/>
+          </w14:schemeClr>
+        </w14:solidFill>
+      </w14:textFill>
     </w:rPr>
   </w:style>
-  <w:style w:type="paragraph" w:styleId="Heading9">
+  <w:style w:type="paragraph" w:styleId="10">
     <w:name w:val="heading 9"/>
-    <w:basedOn w:val="Normal"/>
-    <w:next w:val="Normal"/>
-    <w:link w:val="Heading9Char"/>
-    <w:uiPriority w:val="9"/>
+    <w:basedOn w:val="1"/>
+    <w:next w:val="1"/>
+    <w:link w:val="25"/>
     <w:semiHidden/>
     <w:unhideWhenUsed/>
     <w:qFormat/>
-    <w:rsid w:val="00A076D0"/>
+    <w:uiPriority w:val="9"/>
     <w:pPr>
       <w:keepNext/>
       <w:keepLines/>
@@ -2651,22 +2871,29 @@
     </w:pPr>
     <w:rPr>
       <w:rFonts w:eastAsiaTheme="majorEastAsia" w:cstheme="majorBidi"/>
-      <w:color w:val="272727" w:themeColor="text1" w:themeTint="D8"/>
+      <w:color w:val="262626" w:themeColor="text1" w:themeTint="D9"/>
+      <w14:textFill>
+        <w14:solidFill>
+          <w14:schemeClr w14:val="tx1">
+            <w14:lumMod w14:val="85000"/>
+            <w14:lumOff w14:val="15000"/>
+          </w14:schemeClr>
+        </w14:solidFill>
+      </w14:textFill>
     </w:rPr>
   </w:style>
-  <w:style w:type="character" w:default="1" w:styleId="DefaultParagraphFont">
+  <w:style w:type="character" w:default="1" w:styleId="11">
     <w:name w:val="Default Paragraph Font"/>
-    <w:uiPriority w:val="1"/>
     <w:semiHidden/>
     <w:unhideWhenUsed/>
+    <w:uiPriority w:val="1"/>
   </w:style>
-  <w:style w:type="table" w:default="1" w:styleId="TableNormal">
+  <w:style w:type="table" w:default="1" w:styleId="12">
     <w:name w:val="Normal Table"/>
-    <w:uiPriority w:val="99"/>
     <w:semiHidden/>
     <w:unhideWhenUsed/>
+    <w:uiPriority w:val="99"/>
     <w:tblPr>
-      <w:tblInd w:w="0" w:type="dxa"/>
       <w:tblCellMar>
         <w:top w:w="0" w:type="dxa"/>
         <w:left w:w="108" w:type="dxa"/>
@@ -2675,208 +2902,261 @@
       </w:tblCellMar>
     </w:tblPr>
   </w:style>
-  <w:style w:type="numbering" w:default="1" w:styleId="NoList">
-    <w:name w:val="No List"/>
+  <w:style w:type="paragraph" w:styleId="13">
+    <w:name w:val="footer"/>
+    <w:basedOn w:val="1"/>
+    <w:link w:val="36"/>
+    <w:unhideWhenUsed/>
     <w:uiPriority w:val="99"/>
-    <w:semiHidden/>
+    <w:pPr>
+      <w:tabs>
+        <w:tab w:val="center" w:pos="4513"/>
+        <w:tab w:val="right" w:pos="9026"/>
+      </w:tabs>
+      <w:spacing w:after="0" w:line="240" w:lineRule="auto"/>
+    </w:pPr>
+  </w:style>
+  <w:style w:type="paragraph" w:styleId="14">
+    <w:name w:val="header"/>
+    <w:basedOn w:val="1"/>
+    <w:link w:val="35"/>
     <w:unhideWhenUsed/>
+    <w:uiPriority w:val="99"/>
+    <w:pPr>
+      <w:tabs>
+        <w:tab w:val="center" w:pos="4513"/>
+        <w:tab w:val="right" w:pos="9026"/>
+      </w:tabs>
+      <w:spacing w:after="0" w:line="240" w:lineRule="auto"/>
+    </w:pPr>
   </w:style>
-  <w:style w:type="character" w:customStyle="1" w:styleId="Heading1Char">
-    <w:name w:val="Heading 1 Char"/>
-    <w:basedOn w:val="DefaultParagraphFont"/>
-    <w:link w:val="Heading1"/>
-    <w:uiPriority w:val="9"/>
-    <w:rsid w:val="00A076D0"/>
-    <w:rPr>
-      <w:rFonts w:asciiTheme="majorHAnsi" w:eastAsiaTheme="majorEastAsia" w:hAnsiTheme="majorHAnsi" w:cstheme="majorBidi"/>
-      <w:color w:val="2F5496" w:themeColor="accent1" w:themeShade="BF"/>
-      <w:sz w:val="40"/>
-      <w:szCs w:val="40"/>
-    </w:rPr>
-  </w:style>
-  <w:style w:type="character" w:customStyle="1" w:styleId="Heading2Char">
-    <w:name w:val="Heading 2 Char"/>
-    <w:basedOn w:val="DefaultParagraphFont"/>
-    <w:link w:val="Heading2"/>
-    <w:uiPriority w:val="9"/>
-    <w:semiHidden/>
-    <w:rsid w:val="00A076D0"/>
-    <w:rPr>
-      <w:rFonts w:asciiTheme="majorHAnsi" w:eastAsiaTheme="majorEastAsia" w:hAnsiTheme="majorHAnsi" w:cstheme="majorBidi"/>
-      <w:color w:val="2F5496" w:themeColor="accent1" w:themeShade="BF"/>
-      <w:sz w:val="32"/>
-      <w:szCs w:val="32"/>
-    </w:rPr>
-  </w:style>
-  <w:style w:type="character" w:customStyle="1" w:styleId="Heading3Char">
-    <w:name w:val="Heading 3 Char"/>
-    <w:basedOn w:val="DefaultParagraphFont"/>
-    <w:link w:val="Heading3"/>
-    <w:uiPriority w:val="9"/>
-    <w:semiHidden/>
-    <w:rsid w:val="00A076D0"/>
-    <w:rPr>
-      <w:rFonts w:eastAsiaTheme="majorEastAsia" w:cstheme="majorBidi"/>
-      <w:color w:val="2F5496" w:themeColor="accent1" w:themeShade="BF"/>
-      <w:sz w:val="28"/>
-      <w:szCs w:val="28"/>
-    </w:rPr>
-  </w:style>
-  <w:style w:type="character" w:customStyle="1" w:styleId="Heading4Char">
-    <w:name w:val="Heading 4 Char"/>
-    <w:basedOn w:val="DefaultParagraphFont"/>
-    <w:link w:val="Heading4"/>
-    <w:uiPriority w:val="9"/>
-    <w:semiHidden/>
-    <w:rsid w:val="00A076D0"/>
-    <w:rPr>
-      <w:rFonts w:eastAsiaTheme="majorEastAsia" w:cstheme="majorBidi"/>
-      <w:i/>
-      <w:iCs/>
-      <w:color w:val="2F5496" w:themeColor="accent1" w:themeShade="BF"/>
-    </w:rPr>
-  </w:style>
-  <w:style w:type="character" w:customStyle="1" w:styleId="Heading5Char">
-    <w:name w:val="Heading 5 Char"/>
-    <w:basedOn w:val="DefaultParagraphFont"/>
-    <w:link w:val="Heading5"/>
-    <w:uiPriority w:val="9"/>
-    <w:semiHidden/>
-    <w:rsid w:val="00A076D0"/>
-    <w:rPr>
-      <w:rFonts w:eastAsiaTheme="majorEastAsia" w:cstheme="majorBidi"/>
-      <w:color w:val="2F5496" w:themeColor="accent1" w:themeShade="BF"/>
-    </w:rPr>
-  </w:style>
-  <w:style w:type="character" w:customStyle="1" w:styleId="Heading6Char">
-    <w:name w:val="Heading 6 Char"/>
-    <w:basedOn w:val="DefaultParagraphFont"/>
-    <w:link w:val="Heading6"/>
-    <w:uiPriority w:val="9"/>
-    <w:semiHidden/>
-    <w:rsid w:val="00A076D0"/>
-    <w:rPr>
-      <w:rFonts w:eastAsiaTheme="majorEastAsia" w:cstheme="majorBidi"/>
-      <w:i/>
-      <w:iCs/>
-      <w:color w:val="595959" w:themeColor="text1" w:themeTint="A6"/>
-    </w:rPr>
-  </w:style>
-  <w:style w:type="character" w:customStyle="1" w:styleId="Heading7Char">
-    <w:name w:val="Heading 7 Char"/>
-    <w:basedOn w:val="DefaultParagraphFont"/>
-    <w:link w:val="Heading7"/>
-    <w:uiPriority w:val="9"/>
-    <w:semiHidden/>
-    <w:rsid w:val="00A076D0"/>
+  <w:style w:type="paragraph" w:styleId="15">
+    <w:name w:val="Subtitle"/>
+    <w:basedOn w:val="1"/>
+    <w:next w:val="1"/>
+    <w:link w:val="27"/>
+    <w:qFormat/>
+    <w:uiPriority w:val="11"/>
     <w:rPr>
       <w:rFonts w:eastAsiaTheme="majorEastAsia" w:cstheme="majorBidi"/>
       <w:color w:val="595959" w:themeColor="text1" w:themeTint="A6"/>
+      <w:spacing w:val="15"/>
+      <w:sz w:val="28"/>
+      <w:szCs w:val="28"/>
+      <w14:textFill>
+        <w14:solidFill>
+          <w14:schemeClr w14:val="tx1">
+            <w14:lumMod w14:val="65000"/>
+            <w14:lumOff w14:val="35000"/>
+          </w14:schemeClr>
+        </w14:solidFill>
+      </w14:textFill>
     </w:rPr>
   </w:style>
-  <w:style w:type="character" w:customStyle="1" w:styleId="Heading8Char">
-    <w:name w:val="Heading 8 Char"/>
-    <w:basedOn w:val="DefaultParagraphFont"/>
-    <w:link w:val="Heading8"/>
-    <w:uiPriority w:val="9"/>
-    <w:semiHidden/>
-    <w:rsid w:val="00A076D0"/>
-    <w:rPr>
-      <w:rFonts w:eastAsiaTheme="majorEastAsia" w:cstheme="majorBidi"/>
-      <w:i/>
-      <w:iCs/>
-      <w:color w:val="272727" w:themeColor="text1" w:themeTint="D8"/>
-    </w:rPr>
-  </w:style>
-  <w:style w:type="character" w:customStyle="1" w:styleId="Heading9Char">
-    <w:name w:val="Heading 9 Char"/>
-    <w:basedOn w:val="DefaultParagraphFont"/>
-    <w:link w:val="Heading9"/>
-    <w:uiPriority w:val="9"/>
-    <w:semiHidden/>
-    <w:rsid w:val="00A076D0"/>
-    <w:rPr>
-      <w:rFonts w:eastAsiaTheme="majorEastAsia" w:cstheme="majorBidi"/>
-      <w:color w:val="272727" w:themeColor="text1" w:themeTint="D8"/>
-    </w:rPr>
-  </w:style>
-  <w:style w:type="paragraph" w:styleId="Title">
+  <w:style w:type="paragraph" w:styleId="16">
     <w:name w:val="Title"/>
-    <w:basedOn w:val="Normal"/>
-    <w:next w:val="Normal"/>
-    <w:link w:val="TitleChar"/>
+    <w:basedOn w:val="1"/>
+    <w:next w:val="1"/>
+    <w:link w:val="26"/>
+    <w:qFormat/>
     <w:uiPriority w:val="10"/>
-    <w:qFormat/>
-    <w:rsid w:val="00A076D0"/>
     <w:pPr>
       <w:spacing w:after="80" w:line="240" w:lineRule="auto"/>
       <w:contextualSpacing/>
     </w:pPr>
     <w:rPr>
-      <w:rFonts w:asciiTheme="majorHAnsi" w:eastAsiaTheme="majorEastAsia" w:hAnsiTheme="majorHAnsi" w:cstheme="majorBidi"/>
+      <w:rFonts w:asciiTheme="majorHAnsi" w:hAnsiTheme="majorHAnsi" w:eastAsiaTheme="majorEastAsia" w:cstheme="majorBidi"/>
       <w:spacing w:val="-10"/>
       <w:kern w:val="28"/>
       <w:sz w:val="56"/>
       <w:szCs w:val="56"/>
     </w:rPr>
   </w:style>
-  <w:style w:type="character" w:customStyle="1" w:styleId="TitleChar">
+  <w:style w:type="character" w:customStyle="1" w:styleId="17">
+    <w:name w:val="Heading 1 Char"/>
+    <w:basedOn w:val="11"/>
+    <w:link w:val="2"/>
+    <w:uiPriority w:val="9"/>
+    <w:rPr>
+      <w:rFonts w:asciiTheme="majorHAnsi" w:hAnsiTheme="majorHAnsi" w:eastAsiaTheme="majorEastAsia" w:cstheme="majorBidi"/>
+      <w:color w:val="2F5597" w:themeColor="accent1" w:themeShade="BF"/>
+      <w:sz w:val="40"/>
+      <w:szCs w:val="40"/>
+    </w:rPr>
+  </w:style>
+  <w:style w:type="character" w:customStyle="1" w:styleId="18">
+    <w:name w:val="Heading 2 Char"/>
+    <w:basedOn w:val="11"/>
+    <w:link w:val="3"/>
+    <w:semiHidden/>
+    <w:uiPriority w:val="9"/>
+    <w:rPr>
+      <w:rFonts w:asciiTheme="majorHAnsi" w:hAnsiTheme="majorHAnsi" w:eastAsiaTheme="majorEastAsia" w:cstheme="majorBidi"/>
+      <w:color w:val="2F5597" w:themeColor="accent1" w:themeShade="BF"/>
+      <w:sz w:val="32"/>
+      <w:szCs w:val="32"/>
+    </w:rPr>
+  </w:style>
+  <w:style w:type="character" w:customStyle="1" w:styleId="19">
+    <w:name w:val="Heading 3 Char"/>
+    <w:basedOn w:val="11"/>
+    <w:link w:val="4"/>
+    <w:semiHidden/>
+    <w:uiPriority w:val="9"/>
+    <w:rPr>
+      <w:rFonts w:eastAsiaTheme="majorEastAsia" w:cstheme="majorBidi"/>
+      <w:color w:val="2F5597" w:themeColor="accent1" w:themeShade="BF"/>
+      <w:sz w:val="28"/>
+      <w:szCs w:val="28"/>
+    </w:rPr>
+  </w:style>
+  <w:style w:type="character" w:customStyle="1" w:styleId="20">
+    <w:name w:val="Heading 4 Char"/>
+    <w:basedOn w:val="11"/>
+    <w:link w:val="5"/>
+    <w:semiHidden/>
+    <w:uiPriority w:val="9"/>
+    <w:rPr>
+      <w:rFonts w:eastAsiaTheme="majorEastAsia" w:cstheme="majorBidi"/>
+      <w:i/>
+      <w:iCs/>
+      <w:color w:val="2F5597" w:themeColor="accent1" w:themeShade="BF"/>
+    </w:rPr>
+  </w:style>
+  <w:style w:type="character" w:customStyle="1" w:styleId="21">
+    <w:name w:val="Heading 5 Char"/>
+    <w:basedOn w:val="11"/>
+    <w:link w:val="6"/>
+    <w:semiHidden/>
+    <w:qFormat/>
+    <w:uiPriority w:val="9"/>
+    <w:rPr>
+      <w:rFonts w:eastAsiaTheme="majorEastAsia" w:cstheme="majorBidi"/>
+      <w:color w:val="2F5597" w:themeColor="accent1" w:themeShade="BF"/>
+    </w:rPr>
+  </w:style>
+  <w:style w:type="character" w:customStyle="1" w:styleId="22">
+    <w:name w:val="Heading 6 Char"/>
+    <w:basedOn w:val="11"/>
+    <w:link w:val="7"/>
+    <w:semiHidden/>
+    <w:uiPriority w:val="9"/>
+    <w:rPr>
+      <w:rFonts w:eastAsiaTheme="majorEastAsia" w:cstheme="majorBidi"/>
+      <w:i/>
+      <w:iCs/>
+      <w:color w:val="595959" w:themeColor="text1" w:themeTint="A6"/>
+      <w14:textFill>
+        <w14:solidFill>
+          <w14:schemeClr w14:val="tx1">
+            <w14:lumMod w14:val="65000"/>
+            <w14:lumOff w14:val="35000"/>
+          </w14:schemeClr>
+        </w14:solidFill>
+      </w14:textFill>
+    </w:rPr>
+  </w:style>
+  <w:style w:type="character" w:customStyle="1" w:styleId="23">
+    <w:name w:val="Heading 7 Char"/>
+    <w:basedOn w:val="11"/>
+    <w:link w:val="8"/>
+    <w:semiHidden/>
+    <w:uiPriority w:val="9"/>
+    <w:rPr>
+      <w:rFonts w:eastAsiaTheme="majorEastAsia" w:cstheme="majorBidi"/>
+      <w:color w:val="595959" w:themeColor="text1" w:themeTint="A6"/>
+      <w14:textFill>
+        <w14:solidFill>
+          <w14:schemeClr w14:val="tx1">
+            <w14:lumMod w14:val="65000"/>
+            <w14:lumOff w14:val="35000"/>
+          </w14:schemeClr>
+        </w14:solidFill>
+      </w14:textFill>
+    </w:rPr>
+  </w:style>
+  <w:style w:type="character" w:customStyle="1" w:styleId="24">
+    <w:name w:val="Heading 8 Char"/>
+    <w:basedOn w:val="11"/>
+    <w:link w:val="9"/>
+    <w:semiHidden/>
+    <w:uiPriority w:val="9"/>
+    <w:rPr>
+      <w:rFonts w:eastAsiaTheme="majorEastAsia" w:cstheme="majorBidi"/>
+      <w:i/>
+      <w:iCs/>
+      <w:color w:val="262626" w:themeColor="text1" w:themeTint="D9"/>
+      <w14:textFill>
+        <w14:solidFill>
+          <w14:schemeClr w14:val="tx1">
+            <w14:lumMod w14:val="85000"/>
+            <w14:lumOff w14:val="15000"/>
+          </w14:schemeClr>
+        </w14:solidFill>
+      </w14:textFill>
+    </w:rPr>
+  </w:style>
+  <w:style w:type="character" w:customStyle="1" w:styleId="25">
+    <w:name w:val="Heading 9 Char"/>
+    <w:basedOn w:val="11"/>
+    <w:link w:val="10"/>
+    <w:semiHidden/>
+    <w:uiPriority w:val="9"/>
+    <w:rPr>
+      <w:rFonts w:eastAsiaTheme="majorEastAsia" w:cstheme="majorBidi"/>
+      <w:color w:val="262626" w:themeColor="text1" w:themeTint="D9"/>
+      <w14:textFill>
+        <w14:solidFill>
+          <w14:schemeClr w14:val="tx1">
+            <w14:lumMod w14:val="85000"/>
+            <w14:lumOff w14:val="15000"/>
+          </w14:schemeClr>
+        </w14:solidFill>
+      </w14:textFill>
+    </w:rPr>
+  </w:style>
+  <w:style w:type="character" w:customStyle="1" w:styleId="26">
     <w:name w:val="Title Char"/>
-    <w:basedOn w:val="DefaultParagraphFont"/>
-    <w:link w:val="Title"/>
+    <w:basedOn w:val="11"/>
+    <w:link w:val="16"/>
+    <w:qFormat/>
     <w:uiPriority w:val="10"/>
-    <w:rsid w:val="00A076D0"/>
     <w:rPr>
-      <w:rFonts w:asciiTheme="majorHAnsi" w:eastAsiaTheme="majorEastAsia" w:hAnsiTheme="majorHAnsi" w:cstheme="majorBidi"/>
+      <w:rFonts w:asciiTheme="majorHAnsi" w:hAnsiTheme="majorHAnsi" w:eastAsiaTheme="majorEastAsia" w:cstheme="majorBidi"/>
       <w:spacing w:val="-10"/>
       <w:kern w:val="28"/>
       <w:sz w:val="56"/>
       <w:szCs w:val="56"/>
     </w:rPr>
   </w:style>
-  <w:style w:type="paragraph" w:styleId="Subtitle">
-    <w:name w:val="Subtitle"/>
-    <w:basedOn w:val="Normal"/>
-    <w:next w:val="Normal"/>
-    <w:link w:val="SubtitleChar"/>
+  <w:style w:type="character" w:customStyle="1" w:styleId="27">
+    <w:name w:val="Subtitle Char"/>
+    <w:basedOn w:val="11"/>
+    <w:link w:val="15"/>
     <w:uiPriority w:val="11"/>
-    <w:qFormat/>
-    <w:rsid w:val="00A076D0"/>
-    <w:pPr>
-      <w:numPr>
-        <w:ilvl w:val="1"/>
-      </w:numPr>
-    </w:pPr>
     <w:rPr>
       <w:rFonts w:eastAsiaTheme="majorEastAsia" w:cstheme="majorBidi"/>
       <w:color w:val="595959" w:themeColor="text1" w:themeTint="A6"/>
       <w:spacing w:val="15"/>
       <w:sz w:val="28"/>
       <w:szCs w:val="28"/>
+      <w14:textFill>
+        <w14:solidFill>
+          <w14:schemeClr w14:val="tx1">
+            <w14:lumMod w14:val="65000"/>
+            <w14:lumOff w14:val="35000"/>
+          </w14:schemeClr>
+        </w14:solidFill>
+      </w14:textFill>
     </w:rPr>
   </w:style>
-  <w:style w:type="character" w:customStyle="1" w:styleId="SubtitleChar">
-    <w:name w:val="Subtitle Char"/>
-    <w:basedOn w:val="DefaultParagraphFont"/>
-    <w:link w:val="Subtitle"/>
-    <w:uiPriority w:val="11"/>
-    <w:rsid w:val="00A076D0"/>
-    <w:rPr>
-      <w:rFonts w:eastAsiaTheme="majorEastAsia" w:cstheme="majorBidi"/>
-      <w:color w:val="595959" w:themeColor="text1" w:themeTint="A6"/>
-      <w:spacing w:val="15"/>
-      <w:sz w:val="28"/>
-      <w:szCs w:val="28"/>
-    </w:rPr>
-  </w:style>
-  <w:style w:type="paragraph" w:styleId="Quote">
+  <w:style w:type="paragraph" w:styleId="28">
     <w:name w:val="Quote"/>
-    <w:basedOn w:val="Normal"/>
-    <w:next w:val="Normal"/>
-    <w:link w:val="QuoteChar"/>
+    <w:basedOn w:val="1"/>
+    <w:next w:val="1"/>
+    <w:link w:val="29"/>
+    <w:qFormat/>
     <w:uiPriority w:val="29"/>
-    <w:qFormat/>
-    <w:rsid w:val="00A076D0"/>
     <w:pPr>
       <w:spacing w:before="160"/>
       <w:jc w:val="center"/>
@@ -2885,55 +3165,67 @@
       <w:i/>
       <w:iCs/>
       <w:color w:val="404040" w:themeColor="text1" w:themeTint="BF"/>
+      <w14:textFill>
+        <w14:solidFill>
+          <w14:schemeClr w14:val="tx1">
+            <w14:lumMod w14:val="75000"/>
+            <w14:lumOff w14:val="25000"/>
+          </w14:schemeClr>
+        </w14:solidFill>
+      </w14:textFill>
     </w:rPr>
   </w:style>
-  <w:style w:type="character" w:customStyle="1" w:styleId="QuoteChar">
+  <w:style w:type="character" w:customStyle="1" w:styleId="29">
     <w:name w:val="Quote Char"/>
-    <w:basedOn w:val="DefaultParagraphFont"/>
-    <w:link w:val="Quote"/>
+    <w:basedOn w:val="11"/>
+    <w:link w:val="28"/>
     <w:uiPriority w:val="29"/>
-    <w:rsid w:val="00A076D0"/>
     <w:rPr>
       <w:i/>
       <w:iCs/>
       <w:color w:val="404040" w:themeColor="text1" w:themeTint="BF"/>
+      <w14:textFill>
+        <w14:solidFill>
+          <w14:schemeClr w14:val="tx1">
+            <w14:lumMod w14:val="75000"/>
+            <w14:lumOff w14:val="25000"/>
+          </w14:schemeClr>
+        </w14:solidFill>
+      </w14:textFill>
     </w:rPr>
   </w:style>
-  <w:style w:type="paragraph" w:styleId="ListParagraph">
+  <w:style w:type="paragraph" w:styleId="30">
     <w:name w:val="List Paragraph"/>
-    <w:basedOn w:val="Normal"/>
+    <w:basedOn w:val="1"/>
+    <w:qFormat/>
     <w:uiPriority w:val="34"/>
-    <w:qFormat/>
-    <w:rsid w:val="00A076D0"/>
     <w:pPr>
       <w:ind w:left="720"/>
       <w:contextualSpacing/>
     </w:pPr>
   </w:style>
-  <w:style w:type="character" w:styleId="IntenseEmphasis">
+  <w:style w:type="character" w:customStyle="1" w:styleId="31">
     <w:name w:val="Intense Emphasis"/>
-    <w:basedOn w:val="DefaultParagraphFont"/>
+    <w:basedOn w:val="11"/>
+    <w:qFormat/>
     <w:uiPriority w:val="21"/>
-    <w:qFormat/>
-    <w:rsid w:val="00A076D0"/>
     <w:rPr>
       <w:i/>
       <w:iCs/>
-      <w:color w:val="2F5496" w:themeColor="accent1" w:themeShade="BF"/>
+      <w:color w:val="2F5597" w:themeColor="accent1" w:themeShade="BF"/>
     </w:rPr>
   </w:style>
-  <w:style w:type="paragraph" w:styleId="IntenseQuote">
+  <w:style w:type="paragraph" w:styleId="32">
     <w:name w:val="Intense Quote"/>
-    <w:basedOn w:val="Normal"/>
-    <w:next w:val="Normal"/>
-    <w:link w:val="IntenseQuoteChar"/>
+    <w:basedOn w:val="1"/>
+    <w:next w:val="1"/>
+    <w:link w:val="33"/>
+    <w:qFormat/>
     <w:uiPriority w:val="30"/>
-    <w:qFormat/>
-    <w:rsid w:val="00A076D0"/>
     <w:pPr>
       <w:pBdr>
-        <w:top w:val="single" w:sz="4" w:space="10" w:color="2F5496" w:themeColor="accent1" w:themeShade="BF"/>
-        <w:bottom w:val="single" w:sz="4" w:space="10" w:color="2F5496" w:themeColor="accent1" w:themeShade="BF"/>
+        <w:top w:val="single" w:color="2F5496" w:themeColor="accent1" w:themeShade="BF" w:sz="4" w:space="10"/>
+        <w:bottom w:val="single" w:color="2F5496" w:themeColor="accent1" w:themeShade="BF" w:sz="4" w:space="10"/>
       </w:pBdr>
       <w:spacing w:before="360" w:after="360"/>
       <w:ind w:left="864" w:right="864"/>
@@ -2942,78 +3234,44 @@
     <w:rPr>
       <w:i/>
       <w:iCs/>
-      <w:color w:val="2F5496" w:themeColor="accent1" w:themeShade="BF"/>
+      <w:color w:val="2F5597" w:themeColor="accent1" w:themeShade="BF"/>
     </w:rPr>
   </w:style>
-  <w:style w:type="character" w:customStyle="1" w:styleId="IntenseQuoteChar">
+  <w:style w:type="character" w:customStyle="1" w:styleId="33">
     <w:name w:val="Intense Quote Char"/>
-    <w:basedOn w:val="DefaultParagraphFont"/>
-    <w:link w:val="IntenseQuote"/>
+    <w:basedOn w:val="11"/>
+    <w:link w:val="32"/>
     <w:uiPriority w:val="30"/>
-    <w:rsid w:val="00A076D0"/>
     <w:rPr>
       <w:i/>
       <w:iCs/>
-      <w:color w:val="2F5496" w:themeColor="accent1" w:themeShade="BF"/>
+      <w:color w:val="2F5597" w:themeColor="accent1" w:themeShade="BF"/>
     </w:rPr>
   </w:style>
-  <w:style w:type="character" w:styleId="IntenseReference">
+  <w:style w:type="character" w:customStyle="1" w:styleId="34">
     <w:name w:val="Intense Reference"/>
-    <w:basedOn w:val="DefaultParagraphFont"/>
+    <w:basedOn w:val="11"/>
+    <w:qFormat/>
     <w:uiPriority w:val="32"/>
-    <w:qFormat/>
-    <w:rsid w:val="00A076D0"/>
     <w:rPr>
       <w:b/>
       <w:bCs/>
       <w:smallCaps/>
-      <w:color w:val="2F5496" w:themeColor="accent1" w:themeShade="BF"/>
+      <w:color w:val="2F5597" w:themeColor="accent1" w:themeShade="BF"/>
       <w:spacing w:val="5"/>
     </w:rPr>
   </w:style>
-  <w:style w:type="paragraph" w:styleId="Header">
-    <w:name w:val="header"/>
-    <w:basedOn w:val="Normal"/>
-    <w:link w:val="HeaderChar"/>
+  <w:style w:type="character" w:customStyle="1" w:styleId="35">
+    <w:name w:val="Header Char"/>
+    <w:basedOn w:val="11"/>
+    <w:link w:val="14"/>
     <w:uiPriority w:val="99"/>
-    <w:unhideWhenUsed/>
-    <w:rsid w:val="00553A88"/>
-    <w:pPr>
-      <w:tabs>
-        <w:tab w:val="center" w:pos="4513"/>
-        <w:tab w:val="right" w:pos="9026"/>
-      </w:tabs>
-      <w:spacing w:after="0" w:line="240" w:lineRule="auto"/>
-    </w:pPr>
   </w:style>
-  <w:style w:type="character" w:customStyle="1" w:styleId="HeaderChar">
-    <w:name w:val="Header Char"/>
-    <w:basedOn w:val="DefaultParagraphFont"/>
-    <w:link w:val="Header"/>
+  <w:style w:type="character" w:customStyle="1" w:styleId="36">
+    <w:name w:val="Footer Char"/>
+    <w:basedOn w:val="11"/>
+    <w:link w:val="13"/>
     <w:uiPriority w:val="99"/>
-    <w:rsid w:val="00553A88"/>
-  </w:style>
-  <w:style w:type="paragraph" w:styleId="Footer">
-    <w:name w:val="footer"/>
-    <w:basedOn w:val="Normal"/>
-    <w:link w:val="FooterChar"/>
-    <w:uiPriority w:val="99"/>
-    <w:unhideWhenUsed/>
-    <w:rsid w:val="00553A88"/>
-    <w:pPr>
-      <w:tabs>
-        <w:tab w:val="center" w:pos="4513"/>
-        <w:tab w:val="right" w:pos="9026"/>
-      </w:tabs>
-      <w:spacing w:after="0" w:line="240" w:lineRule="auto"/>
-    </w:pPr>
-  </w:style>
-  <w:style w:type="character" w:customStyle="1" w:styleId="FooterChar">
-    <w:name w:val="Footer Char"/>
-    <w:basedOn w:val="DefaultParagraphFont"/>
-    <w:link w:val="Footer"/>
-    <w:uiPriority w:val="99"/>
-    <w:rsid w:val="00553A88"/>
   </w:style>
 </w:styles>
 </file>
@@ -3061,7 +3319,7 @@
     </a:clrScheme>
     <a:fontScheme name="Office">
       <a:majorFont>
-        <a:latin typeface="Calibri Light" panose="020F0302020204030204"/>
+        <a:latin typeface="Calibri Light"/>
         <a:ea typeface=""/>
         <a:cs typeface=""/>
         <a:font script="Jpan" typeface="游ゴシック Light"/>
@@ -3094,26 +3352,9 @@
         <a:font script="Viet" typeface="Times New Roman"/>
         <a:font script="Uigh" typeface="Microsoft Uighur"/>
         <a:font script="Geor" typeface="Sylfaen"/>
-        <a:font script="Armn" typeface="Arial"/>
-        <a:font script="Bugi" typeface="Leelawadee UI"/>
-        <a:font script="Bopo" typeface="Microsoft JhengHei"/>
-        <a:font script="Java" typeface="Javanese Text"/>
-        <a:font script="Lisu" typeface="Segoe UI"/>
-        <a:font script="Mymr" typeface="Myanmar Text"/>
-        <a:font script="Nkoo" typeface="Ebrima"/>
-        <a:font script="Olck" typeface="Nirmala UI"/>
-        <a:font script="Osma" typeface="Ebrima"/>
-        <a:font script="Phag" typeface="Phagspa"/>
-        <a:font script="Syrn" typeface="Estrangelo Edessa"/>
-        <a:font script="Syrj" typeface="Estrangelo Edessa"/>
-        <a:font script="Syre" typeface="Estrangelo Edessa"/>
-        <a:font script="Sora" typeface="Nirmala UI"/>
-        <a:font script="Tale" typeface="Microsoft Tai Le"/>
-        <a:font script="Talu" typeface="Microsoft New Tai Lue"/>
-        <a:font script="Tfng" typeface="Ebrima"/>
       </a:majorFont>
       <a:minorFont>
-        <a:latin typeface="Calibri" panose="020F0502020204030204"/>
+        <a:latin typeface="Calibri"/>
         <a:ea typeface=""/>
         <a:cs typeface=""/>
         <a:font script="Jpan" typeface="游明朝"/>
@@ -3146,23 +3387,6 @@
         <a:font script="Viet" typeface="Arial"/>
         <a:font script="Uigh" typeface="Microsoft Uighur"/>
         <a:font script="Geor" typeface="Sylfaen"/>
-        <a:font script="Armn" typeface="Arial"/>
-        <a:font script="Bugi" typeface="Leelawadee UI"/>
-        <a:font script="Bopo" typeface="Microsoft JhengHei"/>
-        <a:font script="Java" typeface="Javanese Text"/>
-        <a:font script="Lisu" typeface="Segoe UI"/>
-        <a:font script="Mymr" typeface="Myanmar Text"/>
-        <a:font script="Nkoo" typeface="Ebrima"/>
-        <a:font script="Olck" typeface="Nirmala UI"/>
-        <a:font script="Osma" typeface="Ebrima"/>
-        <a:font script="Phag" typeface="Phagspa"/>
-        <a:font script="Syrn" typeface="Estrangelo Edessa"/>
-        <a:font script="Syrj" typeface="Estrangelo Edessa"/>
-        <a:font script="Syre" typeface="Estrangelo Edessa"/>
-        <a:font script="Sora" typeface="Nirmala UI"/>
-        <a:font script="Tale" typeface="Microsoft Tai Le"/>
-        <a:font script="Talu" typeface="Microsoft New Tai Lue"/>
-        <a:font script="Tfng" typeface="Ebrima"/>
       </a:minorFont>
     </a:fontScheme>
     <a:fmtScheme name="Office">
@@ -3304,11 +3528,5 @@
     </a:fmtScheme>
   </a:themeElements>
   <a:objectDefaults/>
-  <a:extraClrSchemeLst/>
-  <a:extLst>
-    <a:ext uri="{05A4C25C-085E-4340-85A3-A5531E510DB2}">
-      <thm15:themeFamily xmlns:thm15="http://schemas.microsoft.com/office/thememl/2012/main" name="Office Theme" id="{62F939B6-93AF-4DB8-9C6B-D6C7DFDC589F}" vid="{4A3C46E8-61CC-4603-A589-7422A47A8E4A}"/>
-    </a:ext>
-  </a:extLst>
 </a:theme>
 </file>
</xml_diff>